<commit_message>
Update BANK LOGO DOCUMENT 800x250 and 8 other files
</commit_message>
<xml_diff>
--- a/參賽準備/參賽文件/SQL_SPA_Tools_黑客松正式提案書.docx
+++ b/參賽準備/參賽文件/SQL_SPA_Tools_黑客松正式提案書.docx
@@ -53,21 +53,7 @@
           <w:color w:val="202A33"/>
           <w:sz w:val="30"/>
         </w:rPr>
-        <w:t>面向鎖頭銀行風險管理部的本機</w:t>
-      </w:r>
-      <w:r>
-        <w:rPr>
-          <w:color w:val="202A33"/>
-          <w:sz w:val="30"/>
-        </w:rPr>
-        <w:t xml:space="preserve"> SQL </w:t>
-      </w:r>
-      <w:r>
-        <w:rPr>
-          <w:color w:val="202A33"/>
-          <w:sz w:val="30"/>
-        </w:rPr>
-        <w:t>分析與覆核原型</w:t>
+        <w:t>面向鎖頭銀行風險管理部的本機 SQL 分析與覆核原型</w:t>
       </w:r>
     </w:p>
     <w:p>
@@ -80,73 +66,22 @@
     </w:p>
     <w:p>
       <w:r>
-        <w:t>參賽期間：</w:t>
-      </w:r>
-      <w:r>
-        <w:t xml:space="preserve">2026 </w:t>
-      </w:r>
-      <w:r>
-        <w:t>年</w:t>
-      </w:r>
-      <w:r>
-        <w:t xml:space="preserve"> 10 </w:t>
-      </w:r>
-      <w:r>
-        <w:t>月</w:t>
-      </w:r>
-      <w:r>
-        <w:t xml:space="preserve"> 22 </w:t>
-      </w:r>
-      <w:r>
-        <w:t>日至</w:t>
-      </w:r>
-      <w:r>
-        <w:t xml:space="preserve"> 12 </w:t>
-      </w:r>
-      <w:r>
-        <w:t>月</w:t>
-      </w:r>
-      <w:r>
-        <w:t xml:space="preserve"> 24 </w:t>
-      </w:r>
-      <w:r>
-        <w:t>日</w:t>
+        <w:t>參賽期間：2026 年 10 月 22 日至 12 月 24 日</w:t>
       </w:r>
     </w:p>
     <w:p>
       <w:r>
-        <w:t>參賽人員：鎖頭銀行風險管理部</w:t>
-      </w:r>
-      <w:r>
-        <w:t xml:space="preserve"> Dunk</w:t>
+        <w:t>參賽人員：鎖頭銀行風險管理部 Dunk</w:t>
       </w:r>
     </w:p>
     <w:p>
       <w:r>
-        <w:t>作品型態：瀏覽器本機</w:t>
-      </w:r>
-      <w:r>
-        <w:t xml:space="preserve"> SQL </w:t>
-      </w:r>
-      <w:r>
-        <w:t>分析工具＋</w:t>
-      </w:r>
-      <w:r>
-        <w:t xml:space="preserve">Microsoft 365 Copilot Chat </w:t>
-      </w:r>
-      <w:r>
-        <w:t>人工交接流程</w:t>
+        <w:t>作品型態：瀏覽器本機 SQL 分析工具＋Microsoft 365 Copilot Chat 人工交接流程</w:t>
       </w:r>
     </w:p>
     <w:p>
       <w:r>
-        <w:t>提案範圍：以風險分群與報表</w:t>
-      </w:r>
-      <w:r>
-        <w:t xml:space="preserve"> SQL </w:t>
-      </w:r>
-      <w:r>
-        <w:t>變更的影響覆核為展示主線</w:t>
+        <w:t>提案範圍：以風險分群與報表 SQL 變更的影響覆核為展示主線</w:t>
       </w:r>
     </w:p>
     <w:tbl>
@@ -176,35 +111,10 @@
                 <w:b/>
                 <w:color w:val="202A33"/>
               </w:rPr>
-              <w:t>提案摘要</w:t>
+              <w:t xml:space="preserve">提案摘要  </w:t>
             </w:r>
             <w:r>
-              <w:rPr>
-                <w:b/>
-                <w:color w:val="202A33"/>
-              </w:rPr>
-              <w:t xml:space="preserve">  </w:t>
-            </w:r>
-            <w:r>
-              <w:t>本案面向風險管理人員檢視風險分群及報表</w:t>
-            </w:r>
-            <w:r>
-              <w:t xml:space="preserve"> SQL </w:t>
-            </w:r>
-            <w:r>
-              <w:t>變更的情境，以</w:t>
-            </w:r>
-            <w:r>
-              <w:t xml:space="preserve"> SQL Compare </w:t>
-            </w:r>
-            <w:r>
-              <w:t>與欄位血緣整理來源、下游影響及證據，再由</w:t>
-            </w:r>
-            <w:r>
-              <w:t xml:space="preserve"> M365 Copilot Chat </w:t>
-            </w:r>
-            <w:r>
-              <w:t>協助撰寫摘要與覆核清單。全程使用合成資料、使用者確認與人工覆核；不連接銀行資料庫、不代替風險判斷，也不代表變更核准。</w:t>
+              <w:t>本案面向風險管理人員檢視風險分群及報表 SQL 變更的情境，以 SQL Compare 與欄位血緣整理來源、下游影響及證據，再由 M365 Copilot Chat 協助撰寫摘要與覆核清單。全程使用合成資料、使用者確認與人工覆核；不連接銀行資料庫、不代替風險判斷，也不代表變更核准。</w:t>
             </w:r>
           </w:p>
         </w:tc>
@@ -217,25 +127,7 @@
     </w:p>
     <w:p>
       <w:r>
-        <w:t>版本：參賽準備稿｜</w:t>
-      </w:r>
-      <w:r>
-        <w:t xml:space="preserve">2026 </w:t>
-      </w:r>
-      <w:r>
-        <w:t>年</w:t>
-      </w:r>
-      <w:r>
-        <w:t xml:space="preserve"> 10 </w:t>
-      </w:r>
-      <w:r>
-        <w:t>月</w:t>
-      </w:r>
-      <w:r>
-        <w:t xml:space="preserve"> 23 </w:t>
-      </w:r>
-      <w:r>
-        <w:t>日</w:t>
+        <w:t>版本：參賽準備稿｜2026 年 10 月 23 日</w:t>
       </w:r>
     </w:p>
     <w:p>
@@ -254,66 +146,12 @@
     </w:p>
     <w:p>
       <w:r>
-        <w:t>參賽情境以風險管理人員檢視風險指標或風險分群相關</w:t>
-      </w:r>
-      <w:r>
-        <w:t xml:space="preserve"> SQL </w:t>
-      </w:r>
-      <w:r>
-        <w:t>變更為主。覆核者需要理解欄位定義如何連到下游風險輸出與管理報表，並取得可回查的證據和待確認事項。</w:t>
-      </w:r>
-      <w:r>
-        <w:t xml:space="preserve">SQL SPA Tools </w:t>
-      </w:r>
-      <w:r>
-        <w:t>提供本機</w:t>
-      </w:r>
-      <w:r>
-        <w:t xml:space="preserve"> SQL </w:t>
-      </w:r>
-      <w:r>
-        <w:t>比對及欄位血緣分析；</w:t>
-      </w:r>
-      <w:r>
-        <w:t xml:space="preserve">M365 Copilot Chat </w:t>
-      </w:r>
-      <w:r>
-        <w:t>將經確認的摘要整理為易讀說明，協助風險管理人員與</w:t>
-      </w:r>
-      <w:r>
-        <w:t xml:space="preserve"> SQL </w:t>
-      </w:r>
-      <w:r>
-        <w:t>維護者對齊覆核重點。</w:t>
+        <w:t>參賽情境以風險管理人員檢視風險指標或風險分群相關 SQL 變更為主。覆核者需要理解欄位定義如何連到下游風險輸出與管理報表，並取得可回查的證據和待確認事項。SQL SPA Tools 提供本機 SQL 比對及欄位血緣分析；M365 Copilot Chat 將經確認的摘要整理為易讀說明，協助風險管理人員與 SQL 維護者對齊覆核重點。</w:t>
       </w:r>
     </w:p>
     <w:p>
       <w:r>
-        <w:t>系統入口目前索引</w:t>
-      </w:r>
-      <w:r>
-        <w:t xml:space="preserve"> 12 </w:t>
-      </w:r>
-      <w:r>
-        <w:t>項瀏覽器工具；黑客松</w:t>
-      </w:r>
-      <w:r>
-        <w:t xml:space="preserve"> MVP </w:t>
-      </w:r>
-      <w:r>
-        <w:t>集中展示一條風險管理覆核流程：確認</w:t>
-      </w:r>
-      <w:r>
-        <w:t xml:space="preserve"> SQL </w:t>
-      </w:r>
-      <w:r>
-        <w:t>差異、追蹤欄位至風險分群及報表、預覽並下載摘要、由</w:t>
-      </w:r>
-      <w:r>
-        <w:t xml:space="preserve"> Copilot Chat </w:t>
-      </w:r>
-      <w:r>
-        <w:t>彙整待辦，再由人員回查證據。</w:t>
+        <w:t>系統入口目前索引 12 項瀏覽器工具；黑客松 MVP 集中展示一條風險管理覆核流程：確認 SQL 差異、追蹤欄位至風險分群及報表、預覽並下載摘要、由 Copilot Chat 彙整待辦，再由人員回查證據。</w:t>
       </w:r>
     </w:p>
     <w:tbl>
@@ -419,19 +257,7 @@
               <w:rPr>
                 <w:sz w:val="18"/>
               </w:rPr>
-              <w:t>合成</w:t>
-            </w:r>
-            <w:r>
-              <w:rPr>
-                <w:sz w:val="18"/>
-              </w:rPr>
-              <w:t xml:space="preserve"> SQL </w:t>
-            </w:r>
-            <w:r>
-              <w:rPr>
-                <w:sz w:val="18"/>
-              </w:rPr>
-              <w:t>欄位變更對風險分群與管理報表的下游影響覆核</w:t>
+              <w:t>合成 SQL 欄位變更對風險分群與管理報表的下游影響覆核</w:t>
             </w:r>
           </w:p>
         </w:tc>
@@ -472,43 +298,7 @@
               <w:rPr>
                 <w:sz w:val="18"/>
               </w:rPr>
-              <w:t>本機</w:t>
-            </w:r>
-            <w:r>
-              <w:rPr>
-                <w:sz w:val="18"/>
-              </w:rPr>
-              <w:t xml:space="preserve"> SQL Compare</w:t>
-            </w:r>
-            <w:r>
-              <w:rPr>
-                <w:sz w:val="18"/>
-              </w:rPr>
-              <w:t>、欄位血緣分析、</w:t>
-            </w:r>
-            <w:r>
-              <w:rPr>
-                <w:sz w:val="18"/>
-              </w:rPr>
-              <w:t xml:space="preserve">Copilot </w:t>
-            </w:r>
-            <w:r>
-              <w:rPr>
-                <w:sz w:val="18"/>
-              </w:rPr>
-              <w:t>摘要</w:t>
-            </w:r>
-            <w:r>
-              <w:rPr>
-                <w:sz w:val="18"/>
-              </w:rPr>
-              <w:t xml:space="preserve"> JSON </w:t>
-            </w:r>
-            <w:r>
-              <w:rPr>
-                <w:sz w:val="18"/>
-              </w:rPr>
-              <w:t>預覽／確認／下載，以及正常與解析警告測試素材</w:t>
+              <w:t>本機 SQL Compare、欄位血緣分析、Copilot 摘要 JSON 預覽／確認／下載，以及正常與解析警告測試素材</w:t>
             </w:r>
           </w:p>
         </w:tc>
@@ -533,15 +323,7 @@
                 <w:color w:val="202A33"/>
                 <w:sz w:val="18"/>
               </w:rPr>
-              <w:t xml:space="preserve">M365 </w:t>
-            </w:r>
-            <w:r>
-              <w:rPr>
-                <w:b/>
-                <w:color w:val="202A33"/>
-                <w:sz w:val="18"/>
-              </w:rPr>
-              <w:t>交接</w:t>
+              <w:t>M365 交接</w:t>
             </w:r>
           </w:p>
         </w:tc>
@@ -559,31 +341,7 @@
               <w:rPr>
                 <w:sz w:val="18"/>
               </w:rPr>
-              <w:t>使用者檢查並下載</w:t>
-            </w:r>
-            <w:r>
-              <w:rPr>
-                <w:sz w:val="18"/>
-              </w:rPr>
-              <w:t xml:space="preserve"> JSON</w:t>
-            </w:r>
-            <w:r>
-              <w:rPr>
-                <w:sz w:val="18"/>
-              </w:rPr>
-              <w:t>，再手動上傳至</w:t>
-            </w:r>
-            <w:r>
-              <w:rPr>
-                <w:sz w:val="18"/>
-              </w:rPr>
-              <w:t xml:space="preserve"> M365 Copilot Chat</w:t>
-            </w:r>
-            <w:r>
-              <w:rPr>
-                <w:sz w:val="18"/>
-              </w:rPr>
-              <w:t>，貼上固定提示</w:t>
+              <w:t>使用者檢查並下載 JSON，再手動上傳至 M365 Copilot Chat，貼上固定提示</w:t>
             </w:r>
           </w:p>
         </w:tc>
@@ -624,43 +382,7 @@
               <w:rPr>
                 <w:sz w:val="18"/>
               </w:rPr>
-              <w:t>不傳原始</w:t>
-            </w:r>
-            <w:r>
-              <w:rPr>
-                <w:sz w:val="18"/>
-              </w:rPr>
-              <w:t xml:space="preserve"> SQL</w:t>
-            </w:r>
-            <w:r>
-              <w:rPr>
-                <w:sz w:val="18"/>
-              </w:rPr>
-              <w:t>；僅合成資料；使用者確認後才交接；</w:t>
-            </w:r>
-            <w:r>
-              <w:rPr>
-                <w:sz w:val="18"/>
-              </w:rPr>
-              <w:t xml:space="preserve">Copilot </w:t>
-            </w:r>
-            <w:r>
-              <w:rPr>
-                <w:sz w:val="18"/>
-              </w:rPr>
-              <w:t>不執行</w:t>
-            </w:r>
-            <w:r>
-              <w:rPr>
-                <w:sz w:val="18"/>
-              </w:rPr>
-              <w:t xml:space="preserve"> SQL</w:t>
-            </w:r>
-            <w:r>
-              <w:rPr>
-                <w:sz w:val="18"/>
-              </w:rPr>
-              <w:t>、不核准變更</w:t>
+              <w:t>不傳原始 SQL；僅合成資料；使用者確認後才交接；Copilot 不執行 SQL、不核准變更</w:t>
             </w:r>
           </w:p>
         </w:tc>
@@ -741,23 +463,10 @@
                 <w:b/>
                 <w:color w:val="202A33"/>
               </w:rPr>
-              <w:t>本次提案的判讀界線</w:t>
+              <w:t xml:space="preserve">本次提案的判讀界線  </w:t>
             </w:r>
             <w:r>
-              <w:rPr>
-                <w:b/>
-                <w:color w:val="202A33"/>
-              </w:rPr>
-              <w:t xml:space="preserve">  </w:t>
-            </w:r>
-            <w:r>
-              <w:t>預期效益是待驗證的目標，不是已發生的成效。所有時間節省、準確率及</w:t>
-            </w:r>
-            <w:r>
-              <w:t xml:space="preserve"> Copilot </w:t>
-            </w:r>
-            <w:r>
-              <w:t>回覆品質須待正式演練後，以原始紀錄計算。</w:t>
+              <w:t>預期效益是待驗證的目標，不是已發生的成效。所有時間節省、準確率及 Copilot 回覆品質須待正式演練後，以原始紀錄計算。</w:t>
             </w:r>
           </w:p>
         </w:tc>
@@ -778,36 +487,12 @@
     </w:p>
     <w:p>
       <w:r>
-        <w:t>在本參賽情境中，風險管理部人員需要覆核指標及分群相關</w:t>
-      </w:r>
-      <w:r>
-        <w:t xml:space="preserve"> SQL </w:t>
-      </w:r>
-      <w:r>
-        <w:t>的異動，釐清來源欄位、下游風險分群結果與管理報表之間的關係，並整理可供討論的證據和問題。相關</w:t>
-      </w:r>
-      <w:r>
-        <w:t xml:space="preserve"> SQL </w:t>
-      </w:r>
-      <w:r>
-        <w:t>可能由資訊或資料團隊維護；風險管理覆核者則需快速掌握異動範圍與尚待確認事項。</w:t>
+        <w:t>在本參賽情境中，風險管理部人員需要覆核指標及分群相關 SQL 的異動，釐清來源欄位、下游風險分群結果與管理報表之間的關係，並整理可供討論的證據和問題。相關 SQL 可能由資訊或資料團隊維護；風險管理覆核者則需快速掌握異動範圍與尚待確認事項。</w:t>
       </w:r>
     </w:p>
     <w:p>
       <w:r>
-        <w:t>本案將問題聚焦在「</w:t>
-      </w:r>
-      <w:r>
-        <w:t xml:space="preserve">SQL </w:t>
-      </w:r>
-      <w:r>
-        <w:t>欄位變更後，如何協助風險管理人員理解下游風險輸出與報表的影響線索」。本機工具提供可回查的靜態分析，</w:t>
-      </w:r>
-      <w:r>
-        <w:t xml:space="preserve">Copilot </w:t>
-      </w:r>
-      <w:r>
-        <w:t>協助把結構化摘要轉成覆核說明；是否影響風險衡量、是否接受變更，仍由具權責人員依正式程序判斷。</w:t>
+        <w:t>本案將問題聚焦在「SQL 欄位變更後，如何協助風險管理人員理解下游風險輸出與報表的影響線索」。本機工具提供可回查的靜態分析，Copilot 協助把結構化摘要轉成覆核說明；是否影響風險衡量、是否接受變更，仍由具權責人員依正式程序判斷。</w:t>
       </w:r>
     </w:p>
     <w:p>
@@ -820,43 +505,7 @@
     </w:p>
     <w:p>
       <w:r>
-        <w:t>展示者載入合成的變更前後</w:t>
-      </w:r>
-      <w:r>
-        <w:t xml:space="preserve"> SQL </w:t>
-      </w:r>
-      <w:r>
-        <w:t>與下游</w:t>
-      </w:r>
-      <w:r>
-        <w:t xml:space="preserve"> SQL</w:t>
-      </w:r>
-      <w:r>
-        <w:t>，先確認欄位定義差異，再追蹤來源欄位至風險分群欄位及管理報表欄位。風險管理覆核者檢查摘要預覽中的物件名稱、影響證據與分析限制，確認後才下載</w:t>
-      </w:r>
-      <w:r>
-        <w:t xml:space="preserve"> JSON </w:t>
-      </w:r>
-      <w:r>
-        <w:t>並手動交給</w:t>
-      </w:r>
-      <w:r>
-        <w:t xml:space="preserve"> Copilot Chat</w:t>
-      </w:r>
-      <w:r>
-        <w:t>。</w:t>
-      </w:r>
-      <w:r>
-        <w:t xml:space="preserve">Chat </w:t>
-      </w:r>
-      <w:r>
-        <w:t>協助整理影響摘要和待確認清單；風險管理人員及</w:t>
-      </w:r>
-      <w:r>
-        <w:t xml:space="preserve"> SQL </w:t>
-      </w:r>
-      <w:r>
-        <w:t>維護者再共同回查原始證據。</w:t>
+        <w:t>展示者載入合成的變更前後 SQL 與下游 SQL，先確認欄位定義差異，再追蹤來源欄位至風險分群欄位及管理報表欄位。風險管理覆核者檢查摘要預覽中的物件名稱、影響證據與分析限制，確認後才下載 JSON 並手動交給 Copilot Chat。Chat 協助整理影響摘要和待確認清單；風險管理人員及 SQL 維護者再共同回查原始證據。</w:t>
       </w:r>
     </w:p>
     <w:tbl>
@@ -966,15 +615,7 @@
                 <w:sz w:val="18"/>
               </w:rPr>
               <w:lastRenderedPageBreak/>
-              <w:t xml:space="preserve">1 </w:t>
-            </w:r>
-            <w:r>
-              <w:rPr>
-                <w:b/>
-                <w:color w:val="202A33"/>
-                <w:sz w:val="18"/>
-              </w:rPr>
-              <w:t>分析變更</w:t>
+              <w:t>1 分析變更</w:t>
             </w:r>
           </w:p>
         </w:tc>
@@ -992,13 +633,7 @@
               <w:rPr>
                 <w:sz w:val="18"/>
               </w:rPr>
-              <w:t xml:space="preserve">SQL Compare </w:t>
-            </w:r>
-            <w:r>
-              <w:rPr>
-                <w:sz w:val="18"/>
-              </w:rPr>
-              <w:t>顯示前後版本差異</w:t>
+              <w:t>SQL Compare 顯示前後版本差異</w:t>
             </w:r>
           </w:p>
         </w:tc>
@@ -1040,15 +675,7 @@
                 <w:color w:val="202A33"/>
                 <w:sz w:val="18"/>
               </w:rPr>
-              <w:t xml:space="preserve">2 </w:t>
-            </w:r>
-            <w:r>
-              <w:rPr>
-                <w:b/>
-                <w:color w:val="202A33"/>
-                <w:sz w:val="18"/>
-              </w:rPr>
-              <w:t>追蹤欄位</w:t>
+              <w:t>2 追蹤欄位</w:t>
             </w:r>
           </w:p>
         </w:tc>
@@ -1082,13 +709,7 @@
               <w:rPr>
                 <w:sz w:val="18"/>
               </w:rPr>
-              <w:t>只涵蓋已載入且可靜態解析的</w:t>
-            </w:r>
-            <w:r>
-              <w:rPr>
-                <w:sz w:val="18"/>
-              </w:rPr>
-              <w:t xml:space="preserve"> SQL</w:t>
+              <w:t>只涵蓋已載入且可靜態解析的 SQL</w:t>
             </w:r>
           </w:p>
         </w:tc>
@@ -1113,15 +734,7 @@
                 <w:color w:val="202A33"/>
                 <w:sz w:val="18"/>
               </w:rPr>
-              <w:t xml:space="preserve">3 </w:t>
-            </w:r>
-            <w:r>
-              <w:rPr>
-                <w:b/>
-                <w:color w:val="202A33"/>
-                <w:sz w:val="18"/>
-              </w:rPr>
-              <w:t>預覽交接</w:t>
+              <w:t>3 預覽交接</w:t>
             </w:r>
           </w:p>
         </w:tc>
@@ -1139,25 +752,7 @@
               <w:rPr>
                 <w:sz w:val="18"/>
               </w:rPr>
-              <w:t>顯示</w:t>
-            </w:r>
-            <w:r>
-              <w:rPr>
-                <w:sz w:val="18"/>
-              </w:rPr>
-              <w:t xml:space="preserve"> schemaVersion 1.0 </w:t>
-            </w:r>
-            <w:r>
-              <w:rPr>
-                <w:sz w:val="18"/>
-              </w:rPr>
-              <w:t>的最小摘要</w:t>
-            </w:r>
-            <w:r>
-              <w:rPr>
-                <w:sz w:val="18"/>
-              </w:rPr>
-              <w:t xml:space="preserve"> JSON</w:t>
+              <w:t>顯示 schemaVersion 1.0 的最小摘要 JSON</w:t>
             </w:r>
           </w:p>
         </w:tc>
@@ -1199,15 +794,7 @@
                 <w:color w:val="202A33"/>
                 <w:sz w:val="18"/>
               </w:rPr>
-              <w:t xml:space="preserve">4 Copilot </w:t>
-            </w:r>
-            <w:r>
-              <w:rPr>
-                <w:b/>
-                <w:color w:val="202A33"/>
-                <w:sz w:val="18"/>
-              </w:rPr>
-              <w:t>整理</w:t>
+              <w:t>4 Copilot 整理</w:t>
             </w:r>
           </w:p>
         </w:tc>
@@ -1224,13 +811,7 @@
               <w:rPr>
                 <w:sz w:val="18"/>
               </w:rPr>
-              <w:t xml:space="preserve">Chat </w:t>
-            </w:r>
-            <w:r>
-              <w:rPr>
-                <w:sz w:val="18"/>
-              </w:rPr>
-              <w:t>依固定提示整理摘要與建議清單</w:t>
+              <w:t>Chat 依固定提示整理摘要與建議清單</w:t>
             </w:r>
           </w:p>
         </w:tc>
@@ -1272,15 +853,7 @@
                 <w:color w:val="202A33"/>
                 <w:sz w:val="18"/>
               </w:rPr>
-              <w:t xml:space="preserve">5 </w:t>
-            </w:r>
-            <w:r>
-              <w:rPr>
-                <w:b/>
-                <w:color w:val="202A33"/>
-                <w:sz w:val="18"/>
-              </w:rPr>
-              <w:t>人工覆核</w:t>
+              <w:t>5 人工覆核</w:t>
             </w:r>
           </w:p>
         </w:tc>
@@ -1298,31 +871,7 @@
               <w:rPr>
                 <w:sz w:val="18"/>
               </w:rPr>
-              <w:t>對照</w:t>
-            </w:r>
-            <w:r>
-              <w:rPr>
-                <w:sz w:val="18"/>
-              </w:rPr>
-              <w:t xml:space="preserve"> JSON </w:t>
-            </w:r>
-            <w:r>
-              <w:rPr>
-                <w:sz w:val="18"/>
-              </w:rPr>
-              <w:t>與完整</w:t>
-            </w:r>
-            <w:r>
-              <w:rPr>
-                <w:sz w:val="18"/>
-              </w:rPr>
-              <w:t xml:space="preserve"> SQL </w:t>
-            </w:r>
-            <w:r>
-              <w:rPr>
-                <w:sz w:val="18"/>
-              </w:rPr>
-              <w:t>分析結果，記錄待確認項</w:t>
+              <w:t>對照 JSON 與完整 SQL 分析結果，記錄待確認項</w:t>
             </w:r>
           </w:p>
         </w:tc>
@@ -1365,13 +914,7 @@
         <w:spacing w:after="40"/>
       </w:pPr>
       <w:r>
-        <w:t>讓風險覆核有跡可循：先列出來源欄位、風險分群及報表的關係與證據，再請</w:t>
-      </w:r>
-      <w:r>
-        <w:t xml:space="preserve"> Copilot </w:t>
-      </w:r>
-      <w:r>
-        <w:t>協助整理說明；工具不推論風險結果是否合理。</w:t>
+        <w:t>讓風險覆核有跡可循：先列出來源欄位、風險分群及報表的關係與證據，再請 Copilot 協助整理說明；工具不推論風險結果是否合理。</w:t>
       </w:r>
     </w:p>
     <w:p>
@@ -1380,19 +923,7 @@
         <w:spacing w:after="40"/>
       </w:pPr>
       <w:r>
-        <w:t>本機分析與明確交接：原始</w:t>
-      </w:r>
-      <w:r>
-        <w:t xml:space="preserve"> SQL </w:t>
-      </w:r>
-      <w:r>
-        <w:t>留在瀏覽器；</w:t>
-      </w:r>
-      <w:r>
-        <w:t xml:space="preserve">JSON </w:t>
-      </w:r>
-      <w:r>
-        <w:t>預覽把實際送出內容展示給使用者，並要求確認後才可下載。</w:t>
+        <w:t>本機分析與明確交接：原始 SQL 留在瀏覽器；JSON 預覽把實際送出內容展示給使用者，並要求確認後才可下載。</w:t>
       </w:r>
     </w:p>
     <w:p>
@@ -1410,25 +941,7 @@
         <w:spacing w:after="40"/>
       </w:pPr>
       <w:r>
-        <w:t>低門檻原型：以靜態前端工具搭配使用者可用的</w:t>
-      </w:r>
-      <w:r>
-        <w:t xml:space="preserve"> Copilot Chat </w:t>
-      </w:r>
-      <w:r>
-        <w:t>檔案上傳，不依賴目前未具備授權的</w:t>
-      </w:r>
-      <w:r>
-        <w:t xml:space="preserve"> Copilot Studio Agent</w:t>
-      </w:r>
-      <w:r>
-        <w:t>、連接器或</w:t>
-      </w:r>
-      <w:r>
-        <w:t xml:space="preserve"> API </w:t>
-      </w:r>
-      <w:r>
-        <w:t>動作。</w:t>
+        <w:t>低門檻原型：以靜態前端工具搭配使用者可用的 Copilot Chat 檔案上傳，不依賴目前未具備授權的 Copilot Studio Agent、連接器或 API 動作。</w:t>
       </w:r>
     </w:p>
     <w:p>
@@ -1455,52 +968,7 @@
     </w:p>
     <w:p>
       <w:r>
-        <w:t xml:space="preserve">SQL SPA Tools </w:t>
-      </w:r>
-      <w:r>
-        <w:t>由</w:t>
-      </w:r>
-      <w:r>
-        <w:t xml:space="preserve"> HTML</w:t>
-      </w:r>
-      <w:r>
-        <w:t>、</w:t>
-      </w:r>
-      <w:r>
-        <w:t xml:space="preserve">CSS </w:t>
-      </w:r>
-      <w:r>
-        <w:t>與</w:t>
-      </w:r>
-      <w:r>
-        <w:t xml:space="preserve"> JavaScript </w:t>
-      </w:r>
-      <w:r>
-        <w:t>組成，主要分析在使用者瀏覽器分頁執行，設計上支援同資料夾直接開啟及離線使用。欄位血緣分析器將分析列轉為版本化</w:t>
-      </w:r>
-      <w:r>
-        <w:t xml:space="preserve"> JSON </w:t>
-      </w:r>
-      <w:r>
-        <w:t>摘要，供風險管理覆核情境使用。</w:t>
-      </w:r>
-      <w:r>
-        <w:t xml:space="preserve">M365 </w:t>
-      </w:r>
-      <w:r>
-        <w:t>交接目前是人工檔案上傳，不是系統到</w:t>
-      </w:r>
-      <w:r>
-        <w:t xml:space="preserve"> Copilot </w:t>
-      </w:r>
-      <w:r>
-        <w:t>的</w:t>
-      </w:r>
-      <w:r>
-        <w:t xml:space="preserve"> API </w:t>
-      </w:r>
-      <w:r>
-        <w:t>串接。</w:t>
+        <w:t>SQL SPA Tools 由 HTML、CSS 與 JavaScript 組成，主要分析在使用者瀏覽器分頁執行，設計上支援同資料夾直接開啟及離線使用。欄位血緣分析器將分析列轉為版本化 JSON 摘要，供風險管理覆核情境使用。M365 交接目前是人工檔案上傳，不是系統到 Copilot 的 API 串接。</w:t>
       </w:r>
     </w:p>
     <w:tbl>
@@ -1627,19 +1095,7 @@
               <w:rPr>
                 <w:sz w:val="18"/>
               </w:rPr>
-              <w:t>瀏覽器中的</w:t>
-            </w:r>
-            <w:r>
-              <w:rPr>
-                <w:sz w:val="18"/>
-              </w:rPr>
-              <w:t xml:space="preserve"> SQL Compare</w:t>
-            </w:r>
-            <w:r>
-              <w:rPr>
-                <w:sz w:val="18"/>
-              </w:rPr>
-              <w:t>、欄位血緣分析器</w:t>
+              <w:t>瀏覽器中的 SQL Compare、欄位血緣分析器</w:t>
             </w:r>
           </w:p>
         </w:tc>
@@ -1657,19 +1113,7 @@
               <w:rPr>
                 <w:sz w:val="18"/>
               </w:rPr>
-              <w:t>靜態分析結果受輸入完整度與</w:t>
-            </w:r>
-            <w:r>
-              <w:rPr>
-                <w:sz w:val="18"/>
-              </w:rPr>
-              <w:t xml:space="preserve"> parser </w:t>
-            </w:r>
-            <w:r>
-              <w:rPr>
-                <w:sz w:val="18"/>
-              </w:rPr>
-              <w:t>能力限制</w:t>
+              <w:t>靜態分析結果受輸入完整度與 parser 能力限制</w:t>
             </w:r>
           </w:p>
         </w:tc>
@@ -1710,55 +1154,7 @@
               <w:rPr>
                 <w:sz w:val="18"/>
               </w:rPr>
-              <w:t>schemaVersion 1.0 JSON</w:t>
-            </w:r>
-            <w:r>
-              <w:rPr>
-                <w:sz w:val="18"/>
-              </w:rPr>
-              <w:t>，列出</w:t>
-            </w:r>
-            <w:r>
-              <w:rPr>
-                <w:sz w:val="18"/>
-              </w:rPr>
-              <w:t xml:space="preserve"> changes</w:t>
-            </w:r>
-            <w:r>
-              <w:rPr>
-                <w:sz w:val="18"/>
-              </w:rPr>
-              <w:t>、</w:t>
-            </w:r>
-            <w:r>
-              <w:rPr>
-                <w:sz w:val="18"/>
-              </w:rPr>
-              <w:t>impacts</w:t>
-            </w:r>
-            <w:r>
-              <w:rPr>
-                <w:sz w:val="18"/>
-              </w:rPr>
-              <w:t>、</w:t>
-            </w:r>
-            <w:r>
-              <w:rPr>
-                <w:sz w:val="18"/>
-              </w:rPr>
-              <w:t>analysisMessages</w:t>
-            </w:r>
-            <w:r>
-              <w:rPr>
-                <w:sz w:val="18"/>
-              </w:rPr>
-              <w:t>、</w:t>
-            </w:r>
-            <w:r>
-              <w:rPr>
-                <w:sz w:val="18"/>
-              </w:rPr>
-              <w:t>limitations</w:t>
+              <w:t>schemaVersion 1.0 JSON，列出 changes、impacts、analysisMessages、limitations</w:t>
             </w:r>
           </w:p>
         </w:tc>
@@ -1775,19 +1171,7 @@
               <w:rPr>
                 <w:sz w:val="18"/>
               </w:rPr>
-              <w:t>不含原始</w:t>
-            </w:r>
-            <w:r>
-              <w:rPr>
-                <w:sz w:val="18"/>
-              </w:rPr>
-              <w:t xml:space="preserve"> SQL</w:t>
-            </w:r>
-            <w:r>
-              <w:rPr>
-                <w:sz w:val="18"/>
-              </w:rPr>
-              <w:t>、運算式、檔名或解析訊息全文；欄位與物件名稱仍需人工確認</w:t>
+              <w:t>不含原始 SQL、運算式、檔名或解析訊息全文；欄位與物件名稱仍需人工確認</w:t>
             </w:r>
           </w:p>
         </w:tc>
@@ -1830,25 +1214,7 @@
               <w:rPr>
                 <w:sz w:val="18"/>
               </w:rPr>
-              <w:t xml:space="preserve">M365 Copilot Chat </w:t>
-            </w:r>
-            <w:r>
-              <w:rPr>
-                <w:sz w:val="18"/>
-              </w:rPr>
-              <w:t>手動上傳</w:t>
-            </w:r>
-            <w:r>
-              <w:rPr>
-                <w:sz w:val="18"/>
-              </w:rPr>
-              <w:t xml:space="preserve"> JSON</w:t>
-            </w:r>
-            <w:r>
-              <w:rPr>
-                <w:sz w:val="18"/>
-              </w:rPr>
-              <w:t>及固定提示</w:t>
+              <w:t>M365 Copilot Chat 手動上傳 JSON及固定提示</w:t>
             </w:r>
           </w:p>
         </w:tc>
@@ -1962,29 +1328,10 @@
                 <w:b/>
                 <w:color w:val="202A33"/>
               </w:rPr>
-              <w:t>資料安全原則</w:t>
+              <w:t xml:space="preserve">資料安全原則  </w:t>
             </w:r>
             <w:r>
-              <w:rPr>
-                <w:b/>
-                <w:color w:val="202A33"/>
-              </w:rPr>
-              <w:t xml:space="preserve">  </w:t>
-            </w:r>
-            <w:r>
-              <w:t>參賽</w:t>
-            </w:r>
-            <w:r>
-              <w:t xml:space="preserve"> Demo </w:t>
-            </w:r>
-            <w:r>
-              <w:t>僅使用合成</w:t>
-            </w:r>
-            <w:r>
-              <w:t xml:space="preserve"> SQL </w:t>
-            </w:r>
-            <w:r>
-              <w:t>與合成物件名稱。若資料機敏性不明或不符合銀行政策，停止上傳；取得正式環境使用核准前，不將本原型描述為已核准的銀行服務。</w:t>
+              <w:t>參賽 Demo 僅使用合成 SQL 與合成物件名稱。若資料機敏性不明或不符合銀行政策，停止上傳；取得正式環境使用核准前，不將本原型描述為已核准的銀行服務。</w:t>
             </w:r>
           </w:p>
         </w:tc>
@@ -2011,54 +1358,12 @@
     </w:p>
     <w:p>
       <w:r>
-        <w:t>本作品以</w:t>
-      </w:r>
-      <w:r>
-        <w:t xml:space="preserve"> Microsoft 365 Copilot </w:t>
-      </w:r>
-      <w:r>
-        <w:t>輔助軟體規劃與前端開發為參賽主題。開發需求從風險管理覆核者需要理解的欄位差異、下游影響、證據與限制出發，再轉為頁面流程、摘要欄位及測試情境；</w:t>
-      </w:r>
-      <w:r>
-        <w:t xml:space="preserve">Copilot </w:t>
-      </w:r>
-      <w:r>
-        <w:t>可協助整理需求、草擬程式與加速迭代，工程師檢視修改後以合成案例回歸驗證。工具是否符合風險覆核用途與安全邊界，仍須由人員驗收。</w:t>
+        <w:t>本作品以 Microsoft 365 Copilot 輔助軟體規劃與前端開發為參賽主題。開發需求從風險管理覆核者需要理解的欄位差異、下游影響、證據與限制出發，再轉為頁面流程、摘要欄位及測試情境；Copilot 可協助整理需求、草擬程式與加速迭代，工程師檢視修改後以合成案例回歸驗證。工具是否符合風險覆核用途與安全邊界，仍須由人員驗收。</w:t>
       </w:r>
     </w:p>
     <w:p>
       <w:r>
-        <w:t>在</w:t>
-      </w:r>
-      <w:r>
-        <w:t xml:space="preserve"> M365 </w:t>
-      </w:r>
-      <w:r>
-        <w:t>使用端，</w:t>
-      </w:r>
-      <w:r>
-        <w:t xml:space="preserve">Copilot Chat </w:t>
-      </w:r>
-      <w:r>
-        <w:t>不是直接操作工具或資料庫，而是閱讀使用者經確認後上傳的結構化</w:t>
-      </w:r>
-      <w:r>
-        <w:t xml:space="preserve"> JSON</w:t>
-      </w:r>
-      <w:r>
-        <w:t>。固定提示要求保留影響項目與</w:t>
-      </w:r>
-      <w:r>
-        <w:t xml:space="preserve"> evidence</w:t>
-      </w:r>
-      <w:r>
-        <w:t>、標示警告與限制、不推測</w:t>
-      </w:r>
-      <w:r>
-        <w:t xml:space="preserve"> JSON </w:t>
-      </w:r>
-      <w:r>
-        <w:t>以外的關係，並將建議事項清楚標為待工程師確認。</w:t>
+        <w:t>在 M365 使用端，Copilot Chat 不是直接操作工具或資料庫，而是閱讀使用者經確認後上傳的結構化 JSON。固定提示要求保留影響項目與 evidence、標示警告與限制、不推測 JSON 以外的關係，並將建議事項清楚標為待工程師確認。</w:t>
       </w:r>
     </w:p>
     <w:p>
@@ -2087,49 +1392,7 @@
     </w:p>
     <w:p>
       <w:r>
-        <w:t>展示案例以合成欄位</w:t>
-      </w:r>
-      <w:r>
-        <w:t xml:space="preserve"> `DEMO_CUSTOMER.CUSTOMER_SEGMENT` </w:t>
-      </w:r>
-      <w:r>
-        <w:t>長度由</w:t>
-      </w:r>
-      <w:r>
-        <w:t xml:space="preserve"> `VARCHAR2(20)` </w:t>
-      </w:r>
-      <w:r>
-        <w:t>調整為</w:t>
-      </w:r>
-      <w:r>
-        <w:t xml:space="preserve"> `VARCHAR2(40)` </w:t>
-      </w:r>
-      <w:r>
-        <w:t>為例。</w:t>
-      </w:r>
-      <w:r>
-        <w:t xml:space="preserve">expected.json </w:t>
-      </w:r>
-      <w:r>
-        <w:t>設定兩項預期下游影響：風險管理主線為</w:t>
-      </w:r>
-      <w:r>
-        <w:t xml:space="preserve"> `DEMO_RISK_SEGMENTATION.RISK_BUCKET`</w:t>
-      </w:r>
-      <w:r>
-        <w:t>（間接），另有</w:t>
-      </w:r>
-      <w:r>
-        <w:t xml:space="preserve"> `DEMO_MONTHLY_REPORT.SEGMENT_LABEL`</w:t>
-      </w:r>
-      <w:r>
-        <w:t>（直接）。展示重點是讓風險管理覆核者看見欄位變更及其可追溯關係；這些是固定測試資料中的預期結果，不是銀行生產資料、實際風險判斷或</w:t>
-      </w:r>
-      <w:r>
-        <w:t xml:space="preserve"> Copilot </w:t>
-      </w:r>
-      <w:r>
-        <w:t>回答。</w:t>
+        <w:t>展示案例以合成欄位 `DEMO_CUSTOMER.CUSTOMER_SEGMENT` 長度由 `VARCHAR2(20)` 調整為 `VARCHAR2(40)` 為例。expected.json 設定兩項預期下游影響：風險管理主線為 `DEMO_RISK_SEGMENTATION.RISK_BUCKET`（間接），另有 `DEMO_MONTHLY_REPORT.SEGMENT_LABEL`（直接）。展示重點是讓風險管理覆核者看見欄位變更及其可追溯關係；這些是固定測試資料中的預期結果，不是銀行生產資料、實際風險判斷或 Copilot 回答。</w:t>
       </w:r>
     </w:p>
     <w:tbl>
@@ -2256,19 +1519,7 @@
               <w:rPr>
                 <w:sz w:val="18"/>
               </w:rPr>
-              <w:t xml:space="preserve">SQL Compare </w:t>
-            </w:r>
-            <w:r>
-              <w:rPr>
-                <w:sz w:val="18"/>
-              </w:rPr>
-              <w:t>比較變更前後</w:t>
-            </w:r>
-            <w:r>
-              <w:rPr>
-                <w:sz w:val="18"/>
-              </w:rPr>
-              <w:t xml:space="preserve"> DDL</w:t>
+              <w:t>SQL Compare 比較變更前後 DDL</w:t>
             </w:r>
           </w:p>
         </w:tc>
@@ -2327,13 +1578,7 @@
               <w:rPr>
                 <w:sz w:val="18"/>
               </w:rPr>
-              <w:t>欄位血緣測試案例與</w:t>
-            </w:r>
-            <w:r>
-              <w:rPr>
-                <w:sz w:val="18"/>
-              </w:rPr>
-              <w:t xml:space="preserve"> expected.json</w:t>
+              <w:t>欄位血緣測試案例與 expected.json</w:t>
             </w:r>
           </w:p>
         </w:tc>
@@ -2375,15 +1620,7 @@
                 <w:color w:val="202A33"/>
                 <w:sz w:val="18"/>
               </w:rPr>
-              <w:t xml:space="preserve">Copilot </w:t>
-            </w:r>
-            <w:r>
-              <w:rPr>
-                <w:b/>
-                <w:color w:val="202A33"/>
-                <w:sz w:val="18"/>
-              </w:rPr>
-              <w:t>交接</w:t>
+              <w:t>Copilot 交接</w:t>
             </w:r>
           </w:p>
         </w:tc>
@@ -2401,19 +1638,7 @@
               <w:rPr>
                 <w:sz w:val="18"/>
               </w:rPr>
-              <w:t>摘要</w:t>
-            </w:r>
-            <w:r>
-              <w:rPr>
-                <w:sz w:val="18"/>
-              </w:rPr>
-              <w:t xml:space="preserve"> JSON </w:t>
-            </w:r>
-            <w:r>
-              <w:rPr>
-                <w:sz w:val="18"/>
-              </w:rPr>
-              <w:t>預覽、上傳前確認、固定提示</w:t>
+              <w:t>摘要 JSON 預覽、上傳前確認、固定提示</w:t>
             </w:r>
           </w:p>
         </w:tc>
@@ -2472,19 +1697,7 @@
               <w:rPr>
                 <w:sz w:val="18"/>
               </w:rPr>
-              <w:t xml:space="preserve">parser-warning.sql </w:t>
-            </w:r>
-            <w:r>
-              <w:rPr>
-                <w:sz w:val="18"/>
-              </w:rPr>
-              <w:t>預期含</w:t>
-            </w:r>
-            <w:r>
-              <w:rPr>
-                <w:sz w:val="18"/>
-              </w:rPr>
-              <w:t xml:space="preserve"> warn: 1</w:t>
+              <w:t>parser-warning.sql 預期含 warn: 1</w:t>
             </w:r>
           </w:p>
         </w:tc>
@@ -2501,25 +1714,7 @@
               <w:rPr>
                 <w:sz w:val="18"/>
               </w:rPr>
-              <w:t xml:space="preserve">Copilot </w:t>
-            </w:r>
-            <w:r>
-              <w:rPr>
-                <w:sz w:val="18"/>
-              </w:rPr>
-              <w:t>回答須說明限制；此行為仍待</w:t>
-            </w:r>
-            <w:r>
-              <w:rPr>
-                <w:sz w:val="18"/>
-              </w:rPr>
-              <w:t xml:space="preserve"> M365 Chat </w:t>
-            </w:r>
-            <w:r>
-              <w:rPr>
-                <w:sz w:val="18"/>
-              </w:rPr>
-              <w:t>實測</w:t>
+              <w:t>Copilot 回答須說明限制；此行為仍待 M365 Chat 實測</w:t>
             </w:r>
           </w:p>
         </w:tc>
@@ -2540,19 +1735,7 @@
     </w:p>
     <w:p>
       <w:r>
-        <w:t>預期效益是讓風險管理覆核者更快掌握</w:t>
-      </w:r>
-      <w:r>
-        <w:t xml:space="preserve"> SQL </w:t>
-      </w:r>
-      <w:r>
-        <w:t>變更與下游風險分群、管理報表之間的關係，並以一致格式查看證據、解析警告及分析範圍。這些是待驗證的工作目標；目前尚無配對計時、</w:t>
-      </w:r>
-      <w:r>
-        <w:t xml:space="preserve">Copilot Chat </w:t>
-      </w:r>
-      <w:r>
-        <w:t>答案評分或多位參與者結果，不能宣稱已提升風險判斷品質或實際節省工時。</w:t>
+        <w:t>預期效益是讓風險管理覆核者更快掌握 SQL 變更與下游風險分群、管理報表之間的關係，並以一致格式查看證據、解析警告及分析範圍。這些是待驗證的工作目標；目前尚無配對計時、Copilot Chat 答案評分或多位參與者結果，不能宣稱已提升風險判斷品質或實際節省工時。</w:t>
       </w:r>
     </w:p>
     <w:p>
@@ -2693,37 +1876,7 @@
               <w:rPr>
                 <w:sz w:val="18"/>
               </w:rPr>
-              <w:t>(</w:t>
-            </w:r>
-            <w:r>
-              <w:rPr>
-                <w:sz w:val="18"/>
-              </w:rPr>
-              <w:t>人工秒數</w:t>
-            </w:r>
-            <w:r>
-              <w:rPr>
-                <w:sz w:val="18"/>
-              </w:rPr>
-              <w:t xml:space="preserve"> − </w:t>
-            </w:r>
-            <w:r>
-              <w:rPr>
-                <w:sz w:val="18"/>
-              </w:rPr>
-              <w:t>原型秒數</w:t>
-            </w:r>
-            <w:r>
-              <w:rPr>
-                <w:sz w:val="18"/>
-              </w:rPr>
-              <w:t xml:space="preserve">) ÷ </w:t>
-            </w:r>
-            <w:r>
-              <w:rPr>
-                <w:sz w:val="18"/>
-              </w:rPr>
-              <w:t>人工秒數</w:t>
+              <w:t>(人工秒數 − 原型秒數) ÷ 人工秒數</w:t>
             </w:r>
           </w:p>
         </w:tc>
@@ -2741,25 +1894,7 @@
               <w:rPr>
                 <w:sz w:val="18"/>
               </w:rPr>
-              <w:t>同時呈現原始秒數、試次與分布；人工時間為</w:t>
-            </w:r>
-            <w:r>
-              <w:rPr>
-                <w:sz w:val="18"/>
-              </w:rPr>
-              <w:t xml:space="preserve"> 0 </w:t>
-            </w:r>
-            <w:r>
-              <w:rPr>
-                <w:sz w:val="18"/>
-              </w:rPr>
-              <w:t>時記</w:t>
-            </w:r>
-            <w:r>
-              <w:rPr>
-                <w:sz w:val="18"/>
-              </w:rPr>
-              <w:t xml:space="preserve"> N/A</w:t>
+              <w:t>同時呈現原始秒數、試次與分布；人工時間為 0 時記 N/A</w:t>
             </w:r>
           </w:p>
         </w:tc>
@@ -2817,37 +1952,7 @@
               <w:rPr>
                 <w:sz w:val="18"/>
               </w:rPr>
-              <w:t>本案例只有兩項預期影響，必須同時報</w:t>
-            </w:r>
-            <w:r>
-              <w:rPr>
-                <w:sz w:val="18"/>
-              </w:rPr>
-              <w:t xml:space="preserve"> TP</w:t>
-            </w:r>
-            <w:r>
-              <w:rPr>
-                <w:sz w:val="18"/>
-              </w:rPr>
-              <w:t>、</w:t>
-            </w:r>
-            <w:r>
-              <w:rPr>
-                <w:sz w:val="18"/>
-              </w:rPr>
-              <w:t>FN</w:t>
-            </w:r>
-            <w:r>
-              <w:rPr>
-                <w:sz w:val="18"/>
-              </w:rPr>
-              <w:t>、</w:t>
-            </w:r>
-            <w:r>
-              <w:rPr>
-                <w:sz w:val="18"/>
-              </w:rPr>
-              <w:t>FP</w:t>
+              <w:t>本案例只有兩項預期影響，必須同時報 TP、FN、FP</w:t>
             </w:r>
           </w:p>
         </w:tc>
@@ -2949,43 +2054,7 @@
               <w:rPr>
                 <w:sz w:val="18"/>
               </w:rPr>
-              <w:t>具有正確</w:t>
-            </w:r>
-            <w:r>
-              <w:rPr>
-                <w:sz w:val="18"/>
-              </w:rPr>
-              <w:t xml:space="preserve"> JSON evidence </w:t>
-            </w:r>
-            <w:r>
-              <w:rPr>
-                <w:sz w:val="18"/>
-              </w:rPr>
-              <w:t>的</w:t>
-            </w:r>
-            <w:r>
-              <w:rPr>
-                <w:sz w:val="18"/>
-              </w:rPr>
-              <w:t xml:space="preserve"> Copilot </w:t>
-            </w:r>
-            <w:r>
-              <w:rPr>
-                <w:sz w:val="18"/>
-              </w:rPr>
-              <w:t>影響主張</w:t>
-            </w:r>
-            <w:r>
-              <w:rPr>
-                <w:sz w:val="18"/>
-              </w:rPr>
-              <w:t xml:space="preserve"> ÷ </w:t>
-            </w:r>
-            <w:r>
-              <w:rPr>
-                <w:sz w:val="18"/>
-              </w:rPr>
-              <w:t>全部主張</w:t>
+              <w:t>具有正確 JSON evidence 的 Copilot 影響主張 ÷ 全部主張</w:t>
             </w:r>
           </w:p>
         </w:tc>
@@ -3002,19 +2071,7 @@
               <w:rPr>
                 <w:sz w:val="18"/>
               </w:rPr>
-              <w:t>零主張記</w:t>
-            </w:r>
-            <w:r>
-              <w:rPr>
-                <w:sz w:val="18"/>
-              </w:rPr>
-              <w:t xml:space="preserve"> N/A</w:t>
-            </w:r>
-            <w:r>
-              <w:rPr>
-                <w:sz w:val="18"/>
-              </w:rPr>
-              <w:t>；另列無證據及錯誤引用</w:t>
+              <w:t>零主張記 N/A；另列無證據及錯誤引用</w:t>
             </w:r>
           </w:p>
         </w:tc>
@@ -3075,19 +2132,7 @@
               <w:rPr>
                 <w:sz w:val="18"/>
               </w:rPr>
-              <w:t>完成</w:t>
-            </w:r>
-            <w:r>
-              <w:rPr>
-                <w:sz w:val="18"/>
-              </w:rPr>
-              <w:t xml:space="preserve"> Chat </w:t>
-            </w:r>
-            <w:r>
-              <w:rPr>
-                <w:sz w:val="18"/>
-              </w:rPr>
-              <w:t>演練前標示未測</w:t>
+              <w:t>完成 Chat 演練前標示未測</w:t>
             </w:r>
           </w:p>
         </w:tc>
@@ -3099,10 +2144,8 @@
       </w:pPr>
       <w:r>
         <w:rPr>
-          <w:rFonts w:ascii="Microsoft JhengHei" w:hAnsi="Microsoft JhengHei" w:eastAsia="Microsoft JhengHei"/>
-          <w:b/>
+          <w:rFonts w:ascii="微軟正黑體" w:eastAsia="微軟正黑體" w:hAnsi="微軟正黑體"/>
           <w:color w:val="202A33"/>
-          <w:sz w:val="24"/>
         </w:rPr>
         <w:t>質化效益</w:t>
       </w:r>
@@ -3113,12 +2156,33 @@
       </w:pPr>
       <w:r>
         <w:rPr>
-          <w:rFonts w:ascii="Microsoft JhengHei" w:hAnsi="Microsoft JhengHei" w:eastAsia="Microsoft JhengHei"/>
-          <w:b w:val="0"/>
-          <w:color w:val="25323C"/>
           <w:sz w:val="21"/>
         </w:rPr>
-        <w:t>沿欄位來源、風險分群與管理報表呈現可回查 evidence，協助覆核者在不同 SQL 間整理變更脈絡；摘要同時帶出解析警告與分析限制，提示工程師補查。</w:t>
+        <w:t>沿欄位來源、風險分群與管理報表呈現可回查</w:t>
+      </w:r>
+      <w:r>
+        <w:rPr>
+          <w:sz w:val="21"/>
+        </w:rPr>
+        <w:t xml:space="preserve"> evidence</w:t>
+      </w:r>
+      <w:r>
+        <w:rPr>
+          <w:sz w:val="21"/>
+        </w:rPr>
+        <w:t>，協助覆核者在不同</w:t>
+      </w:r>
+      <w:r>
+        <w:rPr>
+          <w:sz w:val="21"/>
+        </w:rPr>
+        <w:t xml:space="preserve"> SQL </w:t>
+      </w:r>
+      <w:r>
+        <w:rPr>
+          <w:sz w:val="21"/>
+        </w:rPr>
+        <w:t>間整理變更脈絡；摘要同時帶出解析警告與分析限制，提示工程師補查。</w:t>
       </w:r>
     </w:p>
     <w:p>
@@ -3127,9 +2191,6 @@
       </w:pPr>
       <w:r>
         <w:rPr>
-          <w:rFonts w:ascii="Microsoft JhengHei" w:hAnsi="Microsoft JhengHei" w:eastAsia="Microsoft JhengHei"/>
-          <w:b w:val="0"/>
-          <w:color w:val="25323C"/>
           <w:sz w:val="21"/>
         </w:rPr>
         <w:t>預期可減少遺漏線索與跨團隊反覆確認，並讓覆核依據更一致。這些屬待驗證的質化效益；風險判斷、工程師覆核與正式核准仍由具權責人員負責。</w:t>
@@ -3141,10 +2202,8 @@
       </w:pPr>
       <w:r>
         <w:rPr>
-          <w:rFonts w:ascii="Microsoft JhengHei" w:hAnsi="Microsoft JhengHei" w:eastAsia="Microsoft JhengHei"/>
-          <w:b/>
+          <w:rFonts w:ascii="微軟正黑體" w:eastAsia="微軟正黑體" w:hAnsi="微軟正黑體"/>
           <w:color w:val="202A33"/>
-          <w:sz w:val="24"/>
         </w:rPr>
         <w:t>量化情境試算</w:t>
       </w:r>
@@ -3155,52 +2214,54 @@
       </w:pPr>
       <w:r>
         <w:rPr>
-          <w:rFonts w:ascii="Microsoft JhengHei" w:hAnsi="Microsoft JhengHei" w:eastAsia="Microsoft JhengHei"/>
-          <w:b w:val="0"/>
-          <w:color w:val="25323C"/>
           <w:sz w:val="21"/>
         </w:rPr>
-        <w:t>以下是規劃用的敏感度情境，不是實測結果。假設完全成本人力單價為每小時 NT$900，並假設每案可回收的覆核時間如下：</w:t>
+        <w:t>以下是規劃用的敏感度情境，不是實測結果。假設完全成本人力單價為每小時</w:t>
+      </w:r>
+      <w:r>
+        <w:rPr>
+          <w:sz w:val="21"/>
+        </w:rPr>
+        <w:t xml:space="preserve"> NT$900</w:t>
+      </w:r>
+      <w:r>
+        <w:rPr>
+          <w:sz w:val="21"/>
+        </w:rPr>
+        <w:t>，並假設每案可回收的覆核時間如下：</w:t>
       </w:r>
     </w:p>
     <w:tbl>
       <w:tblPr>
-        <w:tblStyle w:val="TableGrid"/>
-        <w:tblW w:type="auto" w:w="0"/>
+        <w:tblW w:w="0" w:type="auto"/>
         <w:jc w:val="center"/>
         <w:tblLayout w:type="fixed"/>
-        <w:tblLook w:firstColumn="1" w:firstRow="1" w:lastColumn="0" w:lastRow="0" w:noHBand="0" w:noVBand="1" w:val="04A0"/>
+        <w:tblLook w:val="04A0" w:firstRow="1" w:lastRow="0" w:firstColumn="1" w:lastColumn="0" w:noHBand="0" w:noVBand="1"/>
       </w:tblPr>
       <w:tblGrid>
-        <w:gridCol w:w="1728"/>
-        <w:gridCol w:w="1728"/>
-        <w:gridCol w:w="1728"/>
-        <w:gridCol w:w="1728"/>
-        <w:gridCol w:w="1728"/>
+        <w:gridCol w:w="1080"/>
+        <w:gridCol w:w="1152"/>
+        <w:gridCol w:w="1944"/>
+        <w:gridCol w:w="1296"/>
+        <w:gridCol w:w="1656"/>
       </w:tblGrid>
       <w:tr>
         <w:trPr>
-          <w:tblHeader w:val="true"/>
-          <w:tblHeader w:val="true"/>
-          <w:tblHeader w:val="true"/>
-          <w:tblHeader w:val="true"/>
-          <w:tblHeader w:val="true"/>
+          <w:tblHeader/>
+          <w:jc w:val="center"/>
         </w:trPr>
         <w:tc>
           <w:tcPr>
-            <w:tcW w:type="dxa" w:w="1080"/>
+            <w:tcW w:w="1080" w:type="dxa"/>
+            <w:shd w:val="clear" w:color="auto" w:fill="202A33"/>
             <w:vAlign w:val="center"/>
-            <w:shd w:fill="202A33"/>
           </w:tcPr>
           <w:p>
             <w:pPr>
               <w:spacing w:before="20" w:after="20"/>
-              <w:jc w:val="left"/>
             </w:pPr>
-            <w:r/>
             <w:r>
               <w:rPr>
-                <w:rFonts w:ascii="Microsoft JhengHei" w:hAnsi="Microsoft JhengHei" w:eastAsia="Microsoft JhengHei"/>
                 <w:b/>
                 <w:color w:val="FFFFFF"/>
                 <w:sz w:val="18"/>
@@ -3211,19 +2272,17 @@
         </w:tc>
         <w:tc>
           <w:tcPr>
-            <w:tcW w:type="dxa" w:w="1152"/>
+            <w:tcW w:w="1152" w:type="dxa"/>
+            <w:shd w:val="clear" w:color="auto" w:fill="202A33"/>
             <w:vAlign w:val="center"/>
-            <w:shd w:fill="202A33"/>
           </w:tcPr>
           <w:p>
             <w:pPr>
               <w:spacing w:before="20" w:after="20"/>
               <w:jc w:val="center"/>
             </w:pPr>
-            <w:r/>
             <w:r>
               <w:rPr>
-                <w:rFonts w:ascii="Microsoft JhengHei" w:hAnsi="Microsoft JhengHei" w:eastAsia="Microsoft JhengHei"/>
                 <w:b/>
                 <w:color w:val="FFFFFF"/>
                 <w:sz w:val="18"/>
@@ -3234,19 +2293,17 @@
         </w:tc>
         <w:tc>
           <w:tcPr>
-            <w:tcW w:type="dxa" w:w="1944"/>
+            <w:tcW w:w="1944" w:type="dxa"/>
+            <w:shd w:val="clear" w:color="auto" w:fill="202A33"/>
             <w:vAlign w:val="center"/>
-            <w:shd w:fill="202A33"/>
           </w:tcPr>
           <w:p>
             <w:pPr>
               <w:spacing w:before="20" w:after="20"/>
               <w:jc w:val="center"/>
             </w:pPr>
-            <w:r/>
             <w:r>
               <w:rPr>
-                <w:rFonts w:ascii="Microsoft JhengHei" w:hAnsi="Microsoft JhengHei" w:eastAsia="Microsoft JhengHei"/>
                 <w:b/>
                 <w:color w:val="FFFFFF"/>
                 <w:sz w:val="18"/>
@@ -3257,19 +2314,17 @@
         </w:tc>
         <w:tc>
           <w:tcPr>
-            <w:tcW w:type="dxa" w:w="1296"/>
+            <w:tcW w:w="1296" w:type="dxa"/>
+            <w:shd w:val="clear" w:color="auto" w:fill="202A33"/>
             <w:vAlign w:val="center"/>
-            <w:shd w:fill="202A33"/>
           </w:tcPr>
           <w:p>
             <w:pPr>
               <w:spacing w:before="20" w:after="20"/>
               <w:jc w:val="center"/>
             </w:pPr>
-            <w:r/>
             <w:r>
               <w:rPr>
-                <w:rFonts w:ascii="Microsoft JhengHei" w:hAnsi="Microsoft JhengHei" w:eastAsia="Microsoft JhengHei"/>
                 <w:b/>
                 <w:color w:val="FFFFFF"/>
                 <w:sz w:val="18"/>
@@ -3280,19 +2335,17 @@
         </w:tc>
         <w:tc>
           <w:tcPr>
-            <w:tcW w:type="dxa" w:w="1656"/>
+            <w:tcW w:w="1656" w:type="dxa"/>
+            <w:shd w:val="clear" w:color="auto" w:fill="202A33"/>
             <w:vAlign w:val="center"/>
-            <w:shd w:fill="202A33"/>
           </w:tcPr>
           <w:p>
             <w:pPr>
               <w:spacing w:before="20" w:after="20"/>
               <w:jc w:val="center"/>
             </w:pPr>
-            <w:r/>
             <w:r>
               <w:rPr>
-                <w:rFonts w:ascii="Microsoft JhengHei" w:hAnsi="Microsoft JhengHei" w:eastAsia="Microsoft JhengHei"/>
                 <w:b/>
                 <w:color w:val="FFFFFF"/>
                 <w:sz w:val="18"/>
@@ -3303,23 +2356,21 @@
         </w:tc>
       </w:tr>
       <w:tr>
+        <w:trPr>
+          <w:jc w:val="center"/>
+        </w:trPr>
         <w:tc>
           <w:tcPr>
-            <w:tcW w:type="dxa" w:w="1080"/>
+            <w:tcW w:w="1080" w:type="dxa"/>
+            <w:shd w:val="clear" w:color="auto" w:fill="F7FAFC"/>
             <w:vAlign w:val="center"/>
-            <w:shd w:fill="F7FAFC"/>
           </w:tcPr>
           <w:p>
             <w:pPr>
               <w:spacing w:before="20" w:after="20"/>
-              <w:jc w:val="left"/>
             </w:pPr>
-            <w:r/>
             <w:r>
               <w:rPr>
-                <w:rFonts w:ascii="Microsoft JhengHei" w:hAnsi="Microsoft JhengHei" w:eastAsia="Microsoft JhengHei"/>
-                <w:b w:val="0"/>
-                <w:color w:val="25323C"/>
                 <w:sz w:val="18"/>
               </w:rPr>
               <w:t>保守</w:t>
@@ -3328,90 +2379,92 @@
         </w:tc>
         <w:tc>
           <w:tcPr>
-            <w:tcW w:type="dxa" w:w="1152"/>
+            <w:tcW w:w="1152" w:type="dxa"/>
+            <w:shd w:val="clear" w:color="auto" w:fill="F7FAFC"/>
             <w:vAlign w:val="center"/>
-            <w:shd w:fill="F7FAFC"/>
           </w:tcPr>
           <w:p>
             <w:pPr>
               <w:spacing w:before="20" w:after="20"/>
               <w:jc w:val="center"/>
             </w:pPr>
-            <w:r/>
             <w:r>
               <w:rPr>
-                <w:rFonts w:ascii="Microsoft JhengHei" w:hAnsi="Microsoft JhengHei" w:eastAsia="Microsoft JhengHei"/>
-                <w:b w:val="0"/>
-                <w:color w:val="25323C"/>
                 <w:sz w:val="18"/>
               </w:rPr>
-              <w:t>120 件</w:t>
+              <w:t xml:space="preserve">120 </w:t>
+            </w:r>
+            <w:r>
+              <w:rPr>
+                <w:sz w:val="18"/>
+              </w:rPr>
+              <w:t>件</w:t>
             </w:r>
           </w:p>
         </w:tc>
         <w:tc>
           <w:tcPr>
-            <w:tcW w:type="dxa" w:w="1944"/>
+            <w:tcW w:w="1944" w:type="dxa"/>
+            <w:shd w:val="clear" w:color="auto" w:fill="F7FAFC"/>
             <w:vAlign w:val="center"/>
-            <w:shd w:fill="F7FAFC"/>
           </w:tcPr>
           <w:p>
             <w:pPr>
               <w:spacing w:before="20" w:after="20"/>
               <w:jc w:val="center"/>
             </w:pPr>
-            <w:r/>
             <w:r>
               <w:rPr>
-                <w:rFonts w:ascii="Microsoft JhengHei" w:hAnsi="Microsoft JhengHei" w:eastAsia="Microsoft JhengHei"/>
-                <w:b w:val="0"/>
-                <w:color w:val="25323C"/>
                 <w:sz w:val="18"/>
               </w:rPr>
-              <w:t>10 分鐘</w:t>
+              <w:t xml:space="preserve">10 </w:t>
+            </w:r>
+            <w:r>
+              <w:rPr>
+                <w:sz w:val="18"/>
+              </w:rPr>
+              <w:t>分鐘</w:t>
             </w:r>
           </w:p>
         </w:tc>
         <w:tc>
           <w:tcPr>
-            <w:tcW w:type="dxa" w:w="1296"/>
+            <w:tcW w:w="1296" w:type="dxa"/>
+            <w:shd w:val="clear" w:color="auto" w:fill="F7FAFC"/>
             <w:vAlign w:val="center"/>
-            <w:shd w:fill="F7FAFC"/>
           </w:tcPr>
           <w:p>
             <w:pPr>
               <w:spacing w:before="20" w:after="20"/>
               <w:jc w:val="center"/>
             </w:pPr>
-            <w:r/>
             <w:r>
               <w:rPr>
-                <w:rFonts w:ascii="Microsoft JhengHei" w:hAnsi="Microsoft JhengHei" w:eastAsia="Microsoft JhengHei"/>
-                <w:b w:val="0"/>
-                <w:color w:val="25323C"/>
                 <w:sz w:val="18"/>
               </w:rPr>
-              <w:t>20 小時</w:t>
+              <w:t xml:space="preserve">20 </w:t>
+            </w:r>
+            <w:r>
+              <w:rPr>
+                <w:sz w:val="18"/>
+              </w:rPr>
+              <w:t>小時</w:t>
             </w:r>
           </w:p>
         </w:tc>
         <w:tc>
           <w:tcPr>
-            <w:tcW w:type="dxa" w:w="1656"/>
+            <w:tcW w:w="1656" w:type="dxa"/>
+            <w:shd w:val="clear" w:color="auto" w:fill="F7FAFC"/>
             <w:vAlign w:val="center"/>
-            <w:shd w:fill="F7FAFC"/>
           </w:tcPr>
           <w:p>
             <w:pPr>
               <w:spacing w:before="20" w:after="20"/>
               <w:jc w:val="center"/>
             </w:pPr>
-            <w:r/>
             <w:r>
               <w:rPr>
-                <w:rFonts w:ascii="Microsoft JhengHei" w:hAnsi="Microsoft JhengHei" w:eastAsia="Microsoft JhengHei"/>
-                <w:b w:val="0"/>
-                <w:color w:val="25323C"/>
                 <w:sz w:val="18"/>
               </w:rPr>
               <w:t>NT$18,000</w:t>
@@ -3420,23 +2473,21 @@
         </w:tc>
       </w:tr>
       <w:tr>
+        <w:trPr>
+          <w:jc w:val="center"/>
+        </w:trPr>
         <w:tc>
           <w:tcPr>
-            <w:tcW w:type="dxa" w:w="1080"/>
+            <w:tcW w:w="1080" w:type="dxa"/>
+            <w:shd w:val="clear" w:color="auto" w:fill="FFFFFF"/>
             <w:vAlign w:val="center"/>
-            <w:shd w:fill="FFFFFF"/>
           </w:tcPr>
           <w:p>
             <w:pPr>
               <w:spacing w:before="20" w:after="20"/>
-              <w:jc w:val="left"/>
             </w:pPr>
-            <w:r/>
             <w:r>
               <w:rPr>
-                <w:rFonts w:ascii="Microsoft JhengHei" w:hAnsi="Microsoft JhengHei" w:eastAsia="Microsoft JhengHei"/>
-                <w:b w:val="0"/>
-                <w:color w:val="25323C"/>
                 <w:sz w:val="18"/>
               </w:rPr>
               <w:t>基準</w:t>
@@ -3445,90 +2496,92 @@
         </w:tc>
         <w:tc>
           <w:tcPr>
-            <w:tcW w:type="dxa" w:w="1152"/>
+            <w:tcW w:w="1152" w:type="dxa"/>
+            <w:shd w:val="clear" w:color="auto" w:fill="FFFFFF"/>
             <w:vAlign w:val="center"/>
-            <w:shd w:fill="FFFFFF"/>
           </w:tcPr>
           <w:p>
             <w:pPr>
               <w:spacing w:before="20" w:after="20"/>
               <w:jc w:val="center"/>
             </w:pPr>
-            <w:r/>
             <w:r>
               <w:rPr>
-                <w:rFonts w:ascii="Microsoft JhengHei" w:hAnsi="Microsoft JhengHei" w:eastAsia="Microsoft JhengHei"/>
-                <w:b w:val="0"/>
-                <w:color w:val="25323C"/>
                 <w:sz w:val="18"/>
               </w:rPr>
-              <w:t>300 件</w:t>
+              <w:t xml:space="preserve">300 </w:t>
+            </w:r>
+            <w:r>
+              <w:rPr>
+                <w:sz w:val="18"/>
+              </w:rPr>
+              <w:t>件</w:t>
             </w:r>
           </w:p>
         </w:tc>
         <w:tc>
           <w:tcPr>
-            <w:tcW w:type="dxa" w:w="1944"/>
+            <w:tcW w:w="1944" w:type="dxa"/>
+            <w:shd w:val="clear" w:color="auto" w:fill="FFFFFF"/>
             <w:vAlign w:val="center"/>
-            <w:shd w:fill="FFFFFF"/>
           </w:tcPr>
           <w:p>
             <w:pPr>
               <w:spacing w:before="20" w:after="20"/>
               <w:jc w:val="center"/>
             </w:pPr>
-            <w:r/>
             <w:r>
               <w:rPr>
-                <w:rFonts w:ascii="Microsoft JhengHei" w:hAnsi="Microsoft JhengHei" w:eastAsia="Microsoft JhengHei"/>
-                <w:b w:val="0"/>
-                <w:color w:val="25323C"/>
                 <w:sz w:val="18"/>
               </w:rPr>
-              <w:t>20 分鐘</w:t>
+              <w:t xml:space="preserve">20 </w:t>
+            </w:r>
+            <w:r>
+              <w:rPr>
+                <w:sz w:val="18"/>
+              </w:rPr>
+              <w:t>分鐘</w:t>
             </w:r>
           </w:p>
         </w:tc>
         <w:tc>
           <w:tcPr>
-            <w:tcW w:type="dxa" w:w="1296"/>
+            <w:tcW w:w="1296" w:type="dxa"/>
+            <w:shd w:val="clear" w:color="auto" w:fill="FFFFFF"/>
             <w:vAlign w:val="center"/>
-            <w:shd w:fill="FFFFFF"/>
           </w:tcPr>
           <w:p>
             <w:pPr>
               <w:spacing w:before="20" w:after="20"/>
               <w:jc w:val="center"/>
             </w:pPr>
-            <w:r/>
             <w:r>
               <w:rPr>
-                <w:rFonts w:ascii="Microsoft JhengHei" w:hAnsi="Microsoft JhengHei" w:eastAsia="Microsoft JhengHei"/>
-                <w:b w:val="0"/>
-                <w:color w:val="25323C"/>
                 <w:sz w:val="18"/>
               </w:rPr>
-              <w:t>100 小時</w:t>
+              <w:t xml:space="preserve">100 </w:t>
+            </w:r>
+            <w:r>
+              <w:rPr>
+                <w:sz w:val="18"/>
+              </w:rPr>
+              <w:t>小時</w:t>
             </w:r>
           </w:p>
         </w:tc>
         <w:tc>
           <w:tcPr>
-            <w:tcW w:type="dxa" w:w="1656"/>
+            <w:tcW w:w="1656" w:type="dxa"/>
+            <w:shd w:val="clear" w:color="auto" w:fill="FFFFFF"/>
             <w:vAlign w:val="center"/>
-            <w:shd w:fill="FFFFFF"/>
           </w:tcPr>
           <w:p>
             <w:pPr>
               <w:spacing w:before="20" w:after="20"/>
               <w:jc w:val="center"/>
             </w:pPr>
-            <w:r/>
             <w:r>
               <w:rPr>
-                <w:rFonts w:ascii="Microsoft JhengHei" w:hAnsi="Microsoft JhengHei" w:eastAsia="Microsoft JhengHei"/>
-                <w:b w:val="0"/>
-                <w:color w:val="25323C"/>
                 <w:sz w:val="18"/>
               </w:rPr>
               <w:t>NT$90,000</w:t>
@@ -3537,23 +2590,21 @@
         </w:tc>
       </w:tr>
       <w:tr>
+        <w:trPr>
+          <w:jc w:val="center"/>
+        </w:trPr>
         <w:tc>
           <w:tcPr>
-            <w:tcW w:type="dxa" w:w="1080"/>
+            <w:tcW w:w="1080" w:type="dxa"/>
+            <w:shd w:val="clear" w:color="auto" w:fill="F7FAFC"/>
             <w:vAlign w:val="center"/>
-            <w:shd w:fill="F7FAFC"/>
           </w:tcPr>
           <w:p>
             <w:pPr>
               <w:spacing w:before="20" w:after="20"/>
-              <w:jc w:val="left"/>
             </w:pPr>
-            <w:r/>
             <w:r>
               <w:rPr>
-                <w:rFonts w:ascii="Microsoft JhengHei" w:hAnsi="Microsoft JhengHei" w:eastAsia="Microsoft JhengHei"/>
-                <w:b w:val="0"/>
-                <w:color w:val="25323C"/>
                 <w:sz w:val="18"/>
               </w:rPr>
               <w:t>高量</w:t>
@@ -3562,90 +2613,92 @@
         </w:tc>
         <w:tc>
           <w:tcPr>
-            <w:tcW w:type="dxa" w:w="1152"/>
+            <w:tcW w:w="1152" w:type="dxa"/>
+            <w:shd w:val="clear" w:color="auto" w:fill="F7FAFC"/>
             <w:vAlign w:val="center"/>
-            <w:shd w:fill="F7FAFC"/>
           </w:tcPr>
           <w:p>
             <w:pPr>
               <w:spacing w:before="20" w:after="20"/>
               <w:jc w:val="center"/>
             </w:pPr>
-            <w:r/>
             <w:r>
               <w:rPr>
-                <w:rFonts w:ascii="Microsoft JhengHei" w:hAnsi="Microsoft JhengHei" w:eastAsia="Microsoft JhengHei"/>
-                <w:b w:val="0"/>
-                <w:color w:val="25323C"/>
                 <w:sz w:val="18"/>
               </w:rPr>
-              <w:t>600 件</w:t>
+              <w:t xml:space="preserve">600 </w:t>
+            </w:r>
+            <w:r>
+              <w:rPr>
+                <w:sz w:val="18"/>
+              </w:rPr>
+              <w:t>件</w:t>
             </w:r>
           </w:p>
         </w:tc>
         <w:tc>
           <w:tcPr>
-            <w:tcW w:type="dxa" w:w="1944"/>
+            <w:tcW w:w="1944" w:type="dxa"/>
+            <w:shd w:val="clear" w:color="auto" w:fill="F7FAFC"/>
             <w:vAlign w:val="center"/>
-            <w:shd w:fill="F7FAFC"/>
           </w:tcPr>
           <w:p>
             <w:pPr>
               <w:spacing w:before="20" w:after="20"/>
               <w:jc w:val="center"/>
             </w:pPr>
-            <w:r/>
             <w:r>
               <w:rPr>
-                <w:rFonts w:ascii="Microsoft JhengHei" w:hAnsi="Microsoft JhengHei" w:eastAsia="Microsoft JhengHei"/>
-                <w:b w:val="0"/>
-                <w:color w:val="25323C"/>
                 <w:sz w:val="18"/>
               </w:rPr>
-              <w:t>30 分鐘</w:t>
+              <w:t xml:space="preserve">30 </w:t>
+            </w:r>
+            <w:r>
+              <w:rPr>
+                <w:sz w:val="18"/>
+              </w:rPr>
+              <w:t>分鐘</w:t>
             </w:r>
           </w:p>
         </w:tc>
         <w:tc>
           <w:tcPr>
-            <w:tcW w:type="dxa" w:w="1296"/>
+            <w:tcW w:w="1296" w:type="dxa"/>
+            <w:shd w:val="clear" w:color="auto" w:fill="F7FAFC"/>
             <w:vAlign w:val="center"/>
-            <w:shd w:fill="F7FAFC"/>
           </w:tcPr>
           <w:p>
             <w:pPr>
               <w:spacing w:before="20" w:after="20"/>
               <w:jc w:val="center"/>
             </w:pPr>
-            <w:r/>
             <w:r>
               <w:rPr>
-                <w:rFonts w:ascii="Microsoft JhengHei" w:hAnsi="Microsoft JhengHei" w:eastAsia="Microsoft JhengHei"/>
-                <w:b w:val="0"/>
-                <w:color w:val="25323C"/>
                 <w:sz w:val="18"/>
               </w:rPr>
-              <w:t>300 小時</w:t>
+              <w:t xml:space="preserve">300 </w:t>
+            </w:r>
+            <w:r>
+              <w:rPr>
+                <w:sz w:val="18"/>
+              </w:rPr>
+              <w:t>小時</w:t>
             </w:r>
           </w:p>
         </w:tc>
         <w:tc>
           <w:tcPr>
-            <w:tcW w:type="dxa" w:w="1656"/>
+            <w:tcW w:w="1656" w:type="dxa"/>
+            <w:shd w:val="clear" w:color="auto" w:fill="F7FAFC"/>
             <w:vAlign w:val="center"/>
-            <w:shd w:fill="F7FAFC"/>
           </w:tcPr>
           <w:p>
             <w:pPr>
               <w:spacing w:before="20" w:after="20"/>
               <w:jc w:val="center"/>
             </w:pPr>
-            <w:r/>
             <w:r>
               <w:rPr>
-                <w:rFonts w:ascii="Microsoft JhengHei" w:hAnsi="Microsoft JhengHei" w:eastAsia="Microsoft JhengHei"/>
-                <w:b w:val="0"/>
-                <w:color w:val="25323C"/>
                 <w:sz w:val="18"/>
               </w:rPr>
               <w:t>NT$270,000</w:t>
@@ -3660,12 +2713,45 @@
       </w:pPr>
       <w:r>
         <w:rPr>
-          <w:rFonts w:ascii="Microsoft JhengHei" w:hAnsi="Microsoft JhengHei" w:eastAsia="Microsoft JhengHei"/>
-          <w:b w:val="0"/>
-          <w:color w:val="25323C"/>
           <w:sz w:val="21"/>
         </w:rPr>
-        <w:t>計算：年回收工時＝年案件量 × 每案節省分鐘 ÷ 60；年工時價值＝年回收工時 × NT$900。此處估算的是可重新配置的人力容量，不等同現金收入或已實現節省。</w:t>
+        <w:t>計算：年回收工時＝年案件量</w:t>
+      </w:r>
+      <w:r>
+        <w:rPr>
+          <w:sz w:val="21"/>
+        </w:rPr>
+        <w:t xml:space="preserve"> × </w:t>
+      </w:r>
+      <w:r>
+        <w:rPr>
+          <w:sz w:val="21"/>
+        </w:rPr>
+        <w:t>每案節省分鐘</w:t>
+      </w:r>
+      <w:r>
+        <w:rPr>
+          <w:sz w:val="21"/>
+        </w:rPr>
+        <w:t xml:space="preserve"> ÷ 60</w:t>
+      </w:r>
+      <w:r>
+        <w:rPr>
+          <w:sz w:val="21"/>
+        </w:rPr>
+        <w:t>；年工時價值＝年回收工時</w:t>
+      </w:r>
+      <w:r>
+        <w:rPr>
+          <w:sz w:val="21"/>
+        </w:rPr>
+        <w:t xml:space="preserve"> × NT$900</w:t>
+      </w:r>
+      <w:r>
+        <w:rPr>
+          <w:sz w:val="21"/>
+        </w:rPr>
+        <w:t>。此處估算的是可重新配置的人力容量，不等同現金收入或已實現節省。</w:t>
       </w:r>
     </w:p>
     <w:p>
@@ -3674,12 +2760,93 @@
       </w:pPr>
       <w:r>
         <w:rPr>
-          <w:rFonts w:ascii="Microsoft JhengHei" w:hAnsi="Microsoft JhengHei" w:eastAsia="Microsoft JhengHei"/>
-          <w:b w:val="0"/>
-          <w:color w:val="25323C"/>
           <w:sz w:val="21"/>
         </w:rPr>
-        <w:t>成本項目包括增量 Copilot 授權、建置／導入工時、維護及治理審查。實際金額與人力投入尚未盤點，故目前不報淨效益或 ROI。淨效益＝年工時價值 − 年授權、維護及治理成本 − 年化建置成本；損益兩平案件量＝年成本 ÷（人力單價 × 每案節省分鐘 ÷ 60）。</w:t>
+        <w:t>成本項目包括增量</w:t>
+      </w:r>
+      <w:r>
+        <w:rPr>
+          <w:sz w:val="21"/>
+        </w:rPr>
+        <w:t xml:space="preserve"> Copilot </w:t>
+      </w:r>
+      <w:r>
+        <w:rPr>
+          <w:sz w:val="21"/>
+        </w:rPr>
+        <w:t>授權、建置／導入工時、維護及治理審查。實際金額與人力投入尚未盤點，故目前不報淨效益或</w:t>
+      </w:r>
+      <w:r>
+        <w:rPr>
+          <w:sz w:val="21"/>
+        </w:rPr>
+        <w:t xml:space="preserve"> ROI</w:t>
+      </w:r>
+      <w:r>
+        <w:rPr>
+          <w:sz w:val="21"/>
+        </w:rPr>
+        <w:t>。淨效益＝年工時價值</w:t>
+      </w:r>
+      <w:r>
+        <w:rPr>
+          <w:sz w:val="21"/>
+        </w:rPr>
+        <w:t xml:space="preserve"> − </w:t>
+      </w:r>
+      <w:r>
+        <w:rPr>
+          <w:sz w:val="21"/>
+        </w:rPr>
+        <w:t>年授權、維護及治理成本</w:t>
+      </w:r>
+      <w:r>
+        <w:rPr>
+          <w:sz w:val="21"/>
+        </w:rPr>
+        <w:t xml:space="preserve"> − </w:t>
+      </w:r>
+      <w:r>
+        <w:rPr>
+          <w:sz w:val="21"/>
+        </w:rPr>
+        <w:t>年化建置成本；損益兩平案件量＝年成本</w:t>
+      </w:r>
+      <w:r>
+        <w:rPr>
+          <w:sz w:val="21"/>
+        </w:rPr>
+        <w:t xml:space="preserve"> ÷</w:t>
+      </w:r>
+      <w:r>
+        <w:rPr>
+          <w:sz w:val="21"/>
+        </w:rPr>
+        <w:t>（人力單價</w:t>
+      </w:r>
+      <w:r>
+        <w:rPr>
+          <w:sz w:val="21"/>
+        </w:rPr>
+        <w:t xml:space="preserve"> × </w:t>
+      </w:r>
+      <w:r>
+        <w:rPr>
+          <w:sz w:val="21"/>
+        </w:rPr>
+        <w:t>每案節省分鐘</w:t>
+      </w:r>
+      <w:r>
+        <w:rPr>
+          <w:sz w:val="21"/>
+        </w:rPr>
+        <w:t xml:space="preserve"> ÷ 60</w:t>
+      </w:r>
+      <w:r>
+        <w:rPr>
+          <w:sz w:val="21"/>
+        </w:rPr>
+        <w:t>）。</w:t>
       </w:r>
     </w:p>
     <w:p>
@@ -3688,12 +2855,33 @@
       </w:pPr>
       <w:r>
         <w:rPr>
-          <w:rFonts w:ascii="Microsoft JhengHei" w:hAnsi="Microsoft JhengHei" w:eastAsia="Microsoft JhengHei"/>
-          <w:b w:val="0"/>
-          <w:color w:val="25323C"/>
           <w:sz w:val="21"/>
         </w:rPr>
-        <w:t>案件量、每案節省時間與人力單價均須以銀行內部數據替換。現有配對量測至少安排三次重複，結果回填後才計算實際年效益；Colab 30 項通過及 Formatter 函式微基準只代表工具技術證據，不能當成人工節省。</w:t>
+        <w:t>案件量、每案節省時間與人力單價均須以銀行內部數據替換。現有配對量測至少安排三次重複，結果回填後才計算實際年效益；</w:t>
+      </w:r>
+      <w:r>
+        <w:rPr>
+          <w:sz w:val="21"/>
+        </w:rPr>
+        <w:t xml:space="preserve">Colab 30 </w:t>
+      </w:r>
+      <w:r>
+        <w:rPr>
+          <w:sz w:val="21"/>
+        </w:rPr>
+        <w:t>項通過及</w:t>
+      </w:r>
+      <w:r>
+        <w:rPr>
+          <w:sz w:val="21"/>
+        </w:rPr>
+        <w:t xml:space="preserve"> Formatter </w:t>
+      </w:r>
+      <w:r>
+        <w:rPr>
+          <w:sz w:val="21"/>
+        </w:rPr>
+        <w:t>函式微基準只代表工具技術證據，不能當成人工節省。</w:t>
       </w:r>
     </w:p>
     <w:p>
@@ -3706,37 +2894,7 @@
     </w:p>
     <w:p>
       <w:r>
-        <w:t>參賽期間為</w:t>
-      </w:r>
-      <w:r>
-        <w:t xml:space="preserve"> 2026 </w:t>
-      </w:r>
-      <w:r>
-        <w:t>年</w:t>
-      </w:r>
-      <w:r>
-        <w:t xml:space="preserve"> 10 </w:t>
-      </w:r>
-      <w:r>
-        <w:t>月</w:t>
-      </w:r>
-      <w:r>
-        <w:t xml:space="preserve"> 22 </w:t>
-      </w:r>
-      <w:r>
-        <w:t>日至</w:t>
-      </w:r>
-      <w:r>
-        <w:t xml:space="preserve"> 12 </w:t>
-      </w:r>
-      <w:r>
-        <w:t>月</w:t>
-      </w:r>
-      <w:r>
-        <w:t xml:space="preserve"> 24 </w:t>
-      </w:r>
-      <w:r>
-        <w:t>日。以下為團隊工作安排，不代表主辦單位正式提交期限或活動時程。推廣採先以合成案例驗證、再由資料治理及資訊安全單位審查、最後評估是否擴大工具和使用情境的循序方式。</w:t>
+        <w:t>參賽期間為 2026 年 10 月 22 日至 12 月 24 日。以下為團隊工作安排，不代表主辦單位正式提交期限或活動時程。推廣採先以合成案例驗證、再由資料治理及資訊安全單位審查、最後評估是否擴大工具和使用情境的循序方式。</w:t>
       </w:r>
     </w:p>
     <w:tbl>
@@ -3863,31 +3021,7 @@
               <w:rPr>
                 <w:sz w:val="18"/>
               </w:rPr>
-              <w:t>凍結</w:t>
-            </w:r>
-            <w:r>
-              <w:rPr>
-                <w:sz w:val="18"/>
-              </w:rPr>
-              <w:t xml:space="preserve"> MVP </w:t>
-            </w:r>
-            <w:r>
-              <w:rPr>
-                <w:sz w:val="18"/>
-              </w:rPr>
-              <w:t>流程、合成案例、影響預期清單及</w:t>
-            </w:r>
-            <w:r>
-              <w:rPr>
-                <w:sz w:val="18"/>
-              </w:rPr>
-              <w:t xml:space="preserve"> Copilot </w:t>
-            </w:r>
-            <w:r>
-              <w:rPr>
-                <w:sz w:val="18"/>
-              </w:rPr>
-              <w:t>固定提示</w:t>
+              <w:t>凍結 MVP 流程、合成案例、影響預期清單及 Copilot 固定提示</w:t>
             </w:r>
           </w:p>
         </w:tc>
@@ -3905,19 +3039,7 @@
               <w:rPr>
                 <w:sz w:val="18"/>
               </w:rPr>
-              <w:t>同一版本可重複執行；確認</w:t>
-            </w:r>
-            <w:r>
-              <w:rPr>
-                <w:sz w:val="18"/>
-              </w:rPr>
-              <w:t xml:space="preserve"> demo </w:t>
-            </w:r>
-            <w:r>
-              <w:rPr>
-                <w:sz w:val="18"/>
-              </w:rPr>
-              <w:t>資料安全</w:t>
+              <w:t>同一版本可重複執行；確認 demo 資料安全</w:t>
             </w:r>
           </w:p>
         </w:tc>
@@ -3975,19 +3097,7 @@
               <w:rPr>
                 <w:sz w:val="18"/>
               </w:rPr>
-              <w:t>保存逐次紀錄、</w:t>
-            </w:r>
-            <w:r>
-              <w:rPr>
-                <w:sz w:val="18"/>
-              </w:rPr>
-              <w:t xml:space="preserve">Copilot </w:t>
-            </w:r>
-            <w:r>
-              <w:rPr>
-                <w:sz w:val="18"/>
-              </w:rPr>
-              <w:t>回覆及證據評分</w:t>
+              <w:t>保存逐次紀錄、Copilot 回覆及證據評分</w:t>
             </w:r>
           </w:p>
         </w:tc>
@@ -4119,19 +3229,7 @@
     </w:p>
     <w:p>
       <w:r>
-        <w:t>初期由風險管理部參賽人員</w:t>
-      </w:r>
-      <w:r>
-        <w:t xml:space="preserve"> Dunk </w:t>
-      </w:r>
-      <w:r>
-        <w:t>以合成案例檢視輸出是否有助於覆核溝通，再邀請</w:t>
-      </w:r>
-      <w:r>
-        <w:t xml:space="preserve"> SQL </w:t>
-      </w:r>
-      <w:r>
-        <w:t>維護者與資料治理、資訊安全人員檢視分析邊界及資料交接。若原型驗證通過，才評估擴大至其他風險管理、資訊及資料分析情境；正式推廣仍需審查資料分類、存取、稽核、瀏覽器政策、維運與支援責任。</w:t>
+        <w:t>初期由風險管理部參賽人員 Dunk 以合成案例檢視輸出是否有助於覆核溝通，再邀請 SQL 維護者與資料治理、資訊安全人員檢視分析邊界及資料交接。若原型驗證通過，才評估擴大至其他風險管理、資訊及資料分析情境；正式推廣仍需審查資料分類、存取、稽核、瀏覽器政策、維運與支援責任。</w:t>
       </w:r>
     </w:p>
     <w:p>
@@ -4227,39 +3325,7 @@
                 <w:color w:val="202A33"/>
                 <w:sz w:val="18"/>
               </w:rPr>
-              <w:t>靜態</w:t>
-            </w:r>
-            <w:r>
-              <w:rPr>
-                <w:b/>
-                <w:color w:val="202A33"/>
-                <w:sz w:val="18"/>
-              </w:rPr>
-              <w:t xml:space="preserve"> SQL </w:t>
-            </w:r>
-            <w:r>
-              <w:rPr>
-                <w:b/>
-                <w:color w:val="202A33"/>
-                <w:sz w:val="18"/>
-              </w:rPr>
-              <w:t>分析可能無法涵蓋動態</w:t>
-            </w:r>
-            <w:r>
-              <w:rPr>
-                <w:b/>
-                <w:color w:val="202A33"/>
-                <w:sz w:val="18"/>
-              </w:rPr>
-              <w:t xml:space="preserve"> SQL</w:t>
-            </w:r>
-            <w:r>
-              <w:rPr>
-                <w:b/>
-                <w:color w:val="202A33"/>
-                <w:sz w:val="18"/>
-              </w:rPr>
-              <w:t>、未載入程序或外部報表</w:t>
+              <w:t>靜態 SQL 分析可能無法涵蓋動態 SQL、未載入程序或外部報表</w:t>
             </w:r>
           </w:p>
         </w:tc>
@@ -4301,15 +3367,7 @@
                 <w:color w:val="202A33"/>
                 <w:sz w:val="18"/>
               </w:rPr>
-              <w:t xml:space="preserve">Copilot </w:t>
-            </w:r>
-            <w:r>
-              <w:rPr>
-                <w:b/>
-                <w:color w:val="202A33"/>
-                <w:sz w:val="18"/>
-              </w:rPr>
-              <w:t>可能虛構或誤讀相依關係</w:t>
+              <w:t>Copilot 可能虛構或誤讀相依關係</w:t>
             </w:r>
           </w:p>
         </w:tc>
@@ -4326,31 +3384,7 @@
               <w:rPr>
                 <w:sz w:val="18"/>
               </w:rPr>
-              <w:t>固定提示限制引用</w:t>
-            </w:r>
-            <w:r>
-              <w:rPr>
-                <w:sz w:val="18"/>
-              </w:rPr>
-              <w:t xml:space="preserve"> JSON impacts</w:t>
-            </w:r>
-            <w:r>
-              <w:rPr>
-                <w:sz w:val="18"/>
-              </w:rPr>
-              <w:t>；逐項核對</w:t>
-            </w:r>
-            <w:r>
-              <w:rPr>
-                <w:sz w:val="18"/>
-              </w:rPr>
-              <w:t xml:space="preserve"> evidence</w:t>
-            </w:r>
-            <w:r>
-              <w:rPr>
-                <w:sz w:val="18"/>
-              </w:rPr>
-              <w:t>，保存錯誤回答並評分</w:t>
+              <w:t>固定提示限制引用 JSON impacts；逐項核對 evidence，保存錯誤回答並評分</w:t>
             </w:r>
           </w:p>
         </w:tc>
@@ -4417,15 +3451,7 @@
                 <w:color w:val="202A33"/>
                 <w:sz w:val="18"/>
               </w:rPr>
-              <w:t xml:space="preserve">Chat </w:t>
-            </w:r>
-            <w:r>
-              <w:rPr>
-                <w:b/>
-                <w:color w:val="202A33"/>
-                <w:sz w:val="18"/>
-              </w:rPr>
-              <w:t>上傳或讀取失敗</w:t>
+              <w:t>Chat 上傳或讀取失敗</w:t>
             </w:r>
           </w:p>
         </w:tc>
@@ -4497,11 +3523,16 @@
       </w:pPr>
     </w:p>
     <w:sectPr>
-      <w:headerReference w:type="default" r:id="rId8"/>
-      <w:footerReference w:type="default" r:id="rId9"/>
+      <w:headerReference w:type="even" r:id="rId8"/>
+      <w:headerReference w:type="default" r:id="rId9"/>
+      <w:footerReference w:type="even" r:id="rId10"/>
+      <w:footerReference w:type="default" r:id="rId11"/>
+      <w:headerReference w:type="first" r:id="rId12"/>
+      <w:footerReference w:type="first" r:id="rId13"/>
       <w:pgSz w:w="12240" w:h="15840"/>
       <w:pgMar w:top="1037" w:right="1181" w:bottom="1037" w:left="1181" w:header="720" w:footer="720" w:gutter="0"/>
       <w:cols w:space="720"/>
+      <w:titlePg/>
       <w:docGrid w:linePitch="360"/>
     </w:sectPr>
   </w:body>
@@ -4538,6 +3569,16 @@
   <w:p>
     <w:pPr>
       <w:pStyle w:val="a7"/>
+    </w:pPr>
+  </w:p>
+</w:ftr>
+</file>
+
+<file path=word/footer2.xml><?xml version="1.0" encoding="utf-8"?>
+<w:ftr xmlns:wpc="http://schemas.microsoft.com/office/word/2010/wordprocessingCanvas" xmlns:cx="http://schemas.microsoft.com/office/drawing/2014/chartex" xmlns:cx1="http://schemas.microsoft.com/office/drawing/2015/9/8/chartex" xmlns:cx2="http://schemas.microsoft.com/office/drawing/2015/10/21/chartex" xmlns:cx3="http://schemas.microsoft.com/office/drawing/2016/5/9/chartex" xmlns:cx4="http://schemas.microsoft.com/office/drawing/2016/5/10/chartex" xmlns:cx5="http://schemas.microsoft.com/office/drawing/2016/5/11/chartex" xmlns:cx6="http://schemas.microsoft.com/office/drawing/2016/5/12/chartex" xmlns:cx7="http://schemas.microsoft.com/office/drawing/2016/5/13/chartex" xmlns:cx8="http://schemas.microsoft.com/office/drawing/2016/5/14/chartex" xmlns:mc="http://schemas.openxmlformats.org/markup-compatibility/2006" xmlns:aink="http://schemas.microsoft.com/office/drawing/2016/ink" xmlns:am3d="http://schemas.microsoft.com/office/drawing/2017/model3d" xmlns:o="urn:schemas-microsoft-com:office:office" xmlns:oel="http://schemas.microsoft.com/office/2019/extlst" xmlns:r="http://schemas.openxmlformats.org/officeDocument/2006/relationships" xmlns:m="http://schemas.openxmlformats.org/officeDocument/2006/math" xmlns:v="urn:schemas-microsoft-com:vml" xmlns:wp14="http://schemas.microsoft.com/office/word/2010/wordprocessingDrawing" xmlns:wp="http://schemas.openxmlformats.org/drawingml/2006/wordprocessingDrawing" xmlns:w10="urn:schemas-microsoft-com:office:word" xmlns:w="http://schemas.openxmlformats.org/wordprocessingml/2006/main" xmlns:w14="http://schemas.microsoft.com/office/word/2010/wordml" xmlns:w15="http://schemas.microsoft.com/office/word/2012/wordml" xmlns:w16cex="http://schemas.microsoft.com/office/word/2018/wordml/cex" xmlns:w16cid="http://schemas.microsoft.com/office/word/2016/wordml/cid" xmlns:w16="http://schemas.microsoft.com/office/word/2018/wordml" xmlns:w16du="http://schemas.microsoft.com/office/word/2023/wordml/word16du" xmlns:w16sdtdh="http://schemas.microsoft.com/office/word/2020/wordml/sdtdatahash" xmlns:w16sdtfl="http://schemas.microsoft.com/office/word/2024/wordml/sdtformatlock" xmlns:w16se="http://schemas.microsoft.com/office/word/2015/wordml/symex" xmlns:wpg="http://schemas.microsoft.com/office/word/2010/wordprocessingGroup" xmlns:wpi="http://schemas.microsoft.com/office/word/2010/wordprocessingInk" xmlns:wne="http://schemas.microsoft.com/office/word/2006/wordml" xmlns:wps="http://schemas.microsoft.com/office/word/2010/wordprocessingShape" mc:Ignorable="w14 w15 w16se w16cid w16 w16cex w16sdtdh w16sdtfl w16du wp14">
+  <w:p>
+    <w:pPr>
+      <w:pStyle w:val="a7"/>
       <w:jc w:val="right"/>
     </w:pPr>
     <w:r>
@@ -4545,14 +3586,7 @@
         <w:color w:val="59656E"/>
         <w:sz w:val="16"/>
       </w:rPr>
-      <w:t>參賽提案書</w:t>
-    </w:r>
-    <w:r>
-      <w:rPr>
-        <w:color w:val="59656E"/>
-        <w:sz w:val="16"/>
-      </w:rPr>
-      <w:t xml:space="preserve">   •   2026.10   |   </w:t>
+      <w:t xml:space="preserve">參賽提案書   •   2026.10   |   </w:t>
     </w:r>
     <w:r>
       <w:fldChar w:fldCharType="begin"/>
@@ -4572,6 +3606,16 @@
     <w:r>
       <w:fldChar w:fldCharType="end"/>
     </w:r>
+  </w:p>
+</w:ftr>
+</file>
+
+<file path=word/footer3.xml><?xml version="1.0" encoding="utf-8"?>
+<w:ftr xmlns:wpc="http://schemas.microsoft.com/office/word/2010/wordprocessingCanvas" xmlns:cx="http://schemas.microsoft.com/office/drawing/2014/chartex" xmlns:cx1="http://schemas.microsoft.com/office/drawing/2015/9/8/chartex" xmlns:cx2="http://schemas.microsoft.com/office/drawing/2015/10/21/chartex" xmlns:cx3="http://schemas.microsoft.com/office/drawing/2016/5/9/chartex" xmlns:cx4="http://schemas.microsoft.com/office/drawing/2016/5/10/chartex" xmlns:cx5="http://schemas.microsoft.com/office/drawing/2016/5/11/chartex" xmlns:cx6="http://schemas.microsoft.com/office/drawing/2016/5/12/chartex" xmlns:cx7="http://schemas.microsoft.com/office/drawing/2016/5/13/chartex" xmlns:cx8="http://schemas.microsoft.com/office/drawing/2016/5/14/chartex" xmlns:mc="http://schemas.openxmlformats.org/markup-compatibility/2006" xmlns:aink="http://schemas.microsoft.com/office/drawing/2016/ink" xmlns:am3d="http://schemas.microsoft.com/office/drawing/2017/model3d" xmlns:o="urn:schemas-microsoft-com:office:office" xmlns:oel="http://schemas.microsoft.com/office/2019/extlst" xmlns:r="http://schemas.openxmlformats.org/officeDocument/2006/relationships" xmlns:m="http://schemas.openxmlformats.org/officeDocument/2006/math" xmlns:v="urn:schemas-microsoft-com:vml" xmlns:wp14="http://schemas.microsoft.com/office/word/2010/wordprocessingDrawing" xmlns:wp="http://schemas.openxmlformats.org/drawingml/2006/wordprocessingDrawing" xmlns:w10="urn:schemas-microsoft-com:office:word" xmlns:w="http://schemas.openxmlformats.org/wordprocessingml/2006/main" xmlns:w14="http://schemas.microsoft.com/office/word/2010/wordml" xmlns:w15="http://schemas.microsoft.com/office/word/2012/wordml" xmlns:w16cex="http://schemas.microsoft.com/office/word/2018/wordml/cex" xmlns:w16cid="http://schemas.microsoft.com/office/word/2016/wordml/cid" xmlns:w16="http://schemas.microsoft.com/office/word/2018/wordml" xmlns:w16du="http://schemas.microsoft.com/office/word/2023/wordml/word16du" xmlns:w16sdtdh="http://schemas.microsoft.com/office/word/2020/wordml/sdtdatahash" xmlns:w16sdtfl="http://schemas.microsoft.com/office/word/2024/wordml/sdtformatlock" xmlns:w16se="http://schemas.microsoft.com/office/word/2015/wordml/symex" xmlns:wpg="http://schemas.microsoft.com/office/word/2010/wordprocessingGroup" xmlns:wpi="http://schemas.microsoft.com/office/word/2010/wordprocessingInk" xmlns:wne="http://schemas.microsoft.com/office/word/2006/wordml" xmlns:wps="http://schemas.microsoft.com/office/word/2010/wordprocessingShape" mc:Ignorable="w14 w15 w16se w16cid w16 w16cex w16sdtdh w16sdtfl w16du wp14">
+  <w:p>
+    <w:pPr>
+      <w:pStyle w:val="a7"/>
+    </w:pPr>
   </w:p>
 </w:ftr>
 </file>
@@ -4605,31 +3649,74 @@
 <w:hdr xmlns:wpc="http://schemas.microsoft.com/office/word/2010/wordprocessingCanvas" xmlns:cx="http://schemas.microsoft.com/office/drawing/2014/chartex" xmlns:cx1="http://schemas.microsoft.com/office/drawing/2015/9/8/chartex" xmlns:cx2="http://schemas.microsoft.com/office/drawing/2015/10/21/chartex" xmlns:cx3="http://schemas.microsoft.com/office/drawing/2016/5/9/chartex" xmlns:cx4="http://schemas.microsoft.com/office/drawing/2016/5/10/chartex" xmlns:cx5="http://schemas.microsoft.com/office/drawing/2016/5/11/chartex" xmlns:cx6="http://schemas.microsoft.com/office/drawing/2016/5/12/chartex" xmlns:cx7="http://schemas.microsoft.com/office/drawing/2016/5/13/chartex" xmlns:cx8="http://schemas.microsoft.com/office/drawing/2016/5/14/chartex" xmlns:mc="http://schemas.openxmlformats.org/markup-compatibility/2006" xmlns:aink="http://schemas.microsoft.com/office/drawing/2016/ink" xmlns:am3d="http://schemas.microsoft.com/office/drawing/2017/model3d" xmlns:o="urn:schemas-microsoft-com:office:office" xmlns:oel="http://schemas.microsoft.com/office/2019/extlst" xmlns:r="http://schemas.openxmlformats.org/officeDocument/2006/relationships" xmlns:m="http://schemas.openxmlformats.org/officeDocument/2006/math" xmlns:v="urn:schemas-microsoft-com:vml" xmlns:wp14="http://schemas.microsoft.com/office/word/2010/wordprocessingDrawing" xmlns:wp="http://schemas.openxmlformats.org/drawingml/2006/wordprocessingDrawing" xmlns:w10="urn:schemas-microsoft-com:office:word" xmlns:w="http://schemas.openxmlformats.org/wordprocessingml/2006/main" xmlns:w14="http://schemas.microsoft.com/office/word/2010/wordml" xmlns:w15="http://schemas.microsoft.com/office/word/2012/wordml" xmlns:w16cex="http://schemas.microsoft.com/office/word/2018/wordml/cex" xmlns:w16cid="http://schemas.microsoft.com/office/word/2016/wordml/cid" xmlns:w16="http://schemas.microsoft.com/office/word/2018/wordml" xmlns:w16du="http://schemas.microsoft.com/office/word/2023/wordml/word16du" xmlns:w16sdtdh="http://schemas.microsoft.com/office/word/2020/wordml/sdtdatahash" xmlns:w16sdtfl="http://schemas.microsoft.com/office/word/2024/wordml/sdtformatlock" xmlns:w16se="http://schemas.microsoft.com/office/word/2015/wordml/symex" xmlns:wpg="http://schemas.microsoft.com/office/word/2010/wordprocessingGroup" xmlns:wpi="http://schemas.microsoft.com/office/word/2010/wordprocessingInk" xmlns:wne="http://schemas.microsoft.com/office/word/2006/wordml" xmlns:wps="http://schemas.microsoft.com/office/word/2010/wordprocessingShape" mc:Ignorable="w14 w15 w16se w16cid w16 w16cex w16sdtdh w16sdtfl w16du wp14">
   <w:p>
     <w:pPr>
+      <w:pStyle w:val="a5"/>
+    </w:pPr>
+  </w:p>
+</w:hdr>
+</file>
+
+<file path=word/header2.xml><?xml version="1.0" encoding="utf-8"?>
+<w:hdr xmlns:wpc="http://schemas.microsoft.com/office/word/2010/wordprocessingCanvas" xmlns:cx="http://schemas.microsoft.com/office/drawing/2014/chartex" xmlns:cx1="http://schemas.microsoft.com/office/drawing/2015/9/8/chartex" xmlns:cx2="http://schemas.microsoft.com/office/drawing/2015/10/21/chartex" xmlns:cx3="http://schemas.microsoft.com/office/drawing/2016/5/9/chartex" xmlns:cx4="http://schemas.microsoft.com/office/drawing/2016/5/10/chartex" xmlns:cx5="http://schemas.microsoft.com/office/drawing/2016/5/11/chartex" xmlns:cx6="http://schemas.microsoft.com/office/drawing/2016/5/12/chartex" xmlns:cx7="http://schemas.microsoft.com/office/drawing/2016/5/13/chartex" xmlns:cx8="http://schemas.microsoft.com/office/drawing/2016/5/14/chartex" xmlns:mc="http://schemas.openxmlformats.org/markup-compatibility/2006" xmlns:aink="http://schemas.microsoft.com/office/drawing/2016/ink" xmlns:am3d="http://schemas.microsoft.com/office/drawing/2017/model3d" xmlns:o="urn:schemas-microsoft-com:office:office" xmlns:oel="http://schemas.microsoft.com/office/2019/extlst" xmlns:r="http://schemas.openxmlformats.org/officeDocument/2006/relationships" xmlns:m="http://schemas.openxmlformats.org/officeDocument/2006/math" xmlns:v="urn:schemas-microsoft-com:vml" xmlns:wp14="http://schemas.microsoft.com/office/word/2010/wordprocessingDrawing" xmlns:wp="http://schemas.openxmlformats.org/drawingml/2006/wordprocessingDrawing" xmlns:w10="urn:schemas-microsoft-com:office:word" xmlns:w="http://schemas.openxmlformats.org/wordprocessingml/2006/main" xmlns:w14="http://schemas.microsoft.com/office/word/2010/wordml" xmlns:w15="http://schemas.microsoft.com/office/word/2012/wordml" xmlns:w16cex="http://schemas.microsoft.com/office/word/2018/wordml/cex" xmlns:w16cid="http://schemas.microsoft.com/office/word/2016/wordml/cid" xmlns:w16="http://schemas.microsoft.com/office/word/2018/wordml" xmlns:w16du="http://schemas.microsoft.com/office/word/2023/wordml/word16du" xmlns:w16sdtdh="http://schemas.microsoft.com/office/word/2020/wordml/sdtdatahash" xmlns:w16sdtfl="http://schemas.microsoft.com/office/word/2024/wordml/sdtformatlock" xmlns:w16se="http://schemas.microsoft.com/office/word/2015/wordml/symex" xmlns:wpg="http://schemas.microsoft.com/office/word/2010/wordprocessingGroup" xmlns:wpi="http://schemas.microsoft.com/office/word/2010/wordprocessingInk" xmlns:wne="http://schemas.microsoft.com/office/word/2006/wordml" xmlns:wps="http://schemas.microsoft.com/office/word/2010/wordprocessingShape" mc:Ignorable="w14 w15 w16se w16cid w16 w16cex w16sdtdh w16sdtfl w16du wp14">
+  <w:p>
+    <w:pPr>
       <w:pStyle w:val="af7"/>
     </w:pPr>
     <w:r>
       <w:rPr>
         <w:color w:val="25323C"/>
       </w:rPr>
-      <w:t xml:space="preserve">SQL SPA TOOLS  /  </w:t>
+      <w:t>SQL SPA TOOLS  /  鎖頭銀行 M365 COPILOT 黑客松</w:t>
     </w:r>
+  </w:p>
+</w:hdr>
+</file>
+
+<file path=word/header3.xml><?xml version="1.0" encoding="utf-8"?>
+<w:hdr xmlns:wpc="http://schemas.microsoft.com/office/word/2010/wordprocessingCanvas" xmlns:cx="http://schemas.microsoft.com/office/drawing/2014/chartex" xmlns:cx1="http://schemas.microsoft.com/office/drawing/2015/9/8/chartex" xmlns:cx2="http://schemas.microsoft.com/office/drawing/2015/10/21/chartex" xmlns:cx3="http://schemas.microsoft.com/office/drawing/2016/5/9/chartex" xmlns:cx4="http://schemas.microsoft.com/office/drawing/2016/5/10/chartex" xmlns:cx5="http://schemas.microsoft.com/office/drawing/2016/5/11/chartex" xmlns:cx6="http://schemas.microsoft.com/office/drawing/2016/5/12/chartex" xmlns:cx7="http://schemas.microsoft.com/office/drawing/2016/5/13/chartex" xmlns:cx8="http://schemas.microsoft.com/office/drawing/2016/5/14/chartex" xmlns:mc="http://schemas.openxmlformats.org/markup-compatibility/2006" xmlns:aink="http://schemas.microsoft.com/office/drawing/2016/ink" xmlns:am3d="http://schemas.microsoft.com/office/drawing/2017/model3d" xmlns:o="urn:schemas-microsoft-com:office:office" xmlns:oel="http://schemas.microsoft.com/office/2019/extlst" xmlns:r="http://schemas.openxmlformats.org/officeDocument/2006/relationships" xmlns:m="http://schemas.openxmlformats.org/officeDocument/2006/math" xmlns:v="urn:schemas-microsoft-com:vml" xmlns:wp14="http://schemas.microsoft.com/office/word/2010/wordprocessingDrawing" xmlns:wp="http://schemas.openxmlformats.org/drawingml/2006/wordprocessingDrawing" xmlns:w10="urn:schemas-microsoft-com:office:word" xmlns:w="http://schemas.openxmlformats.org/wordprocessingml/2006/main" xmlns:w14="http://schemas.microsoft.com/office/word/2010/wordml" xmlns:w15="http://schemas.microsoft.com/office/word/2012/wordml" xmlns:w16cex="http://schemas.microsoft.com/office/word/2018/wordml/cex" xmlns:w16cid="http://schemas.microsoft.com/office/word/2016/wordml/cid" xmlns:w16="http://schemas.microsoft.com/office/word/2018/wordml" xmlns:w16du="http://schemas.microsoft.com/office/word/2023/wordml/word16du" xmlns:w16sdtdh="http://schemas.microsoft.com/office/word/2020/wordml/sdtdatahash" xmlns:w16sdtfl="http://schemas.microsoft.com/office/word/2024/wordml/sdtformatlock" xmlns:w16se="http://schemas.microsoft.com/office/word/2015/wordml/symex" xmlns:wpg="http://schemas.microsoft.com/office/word/2010/wordprocessingGroup" xmlns:wpi="http://schemas.microsoft.com/office/word/2010/wordprocessingInk" xmlns:wne="http://schemas.microsoft.com/office/word/2006/wordml" xmlns:wps="http://schemas.microsoft.com/office/word/2010/wordprocessingShape" mc:Ignorable="w14 w15 w16se w16cid w16 w16cex w16sdtdh w16sdtfl w16du wp14">
+  <w:p>
+    <w:pPr>
+      <w:pStyle w:val="a5"/>
+      <w:jc w:val="right"/>
+    </w:pPr>
     <w:r>
       <w:rPr>
-        <w:color w:val="25323C"/>
-      </w:rPr>
-      <w:t>鎖頭銀行</w:t>
-    </w:r>
-    <w:r>
-      <w:rPr>
-        <w:color w:val="25323C"/>
-      </w:rPr>
-      <w:t xml:space="preserve"> M365 COPILOT </w:t>
-    </w:r>
-    <w:r>
-      <w:rPr>
-        <w:color w:val="25323C"/>
-      </w:rPr>
-      <w:t>黑客松</w:t>
+        <w:noProof/>
+      </w:rPr>
+      <w:drawing>
+        <wp:inline distT="0" distB="0" distL="0" distR="0" wp14:anchorId="2F0379A1" wp14:editId="3F02CEA3">
+          <wp:extent cx="1803400" cy="563563"/>
+          <wp:effectExtent l="0" t="0" r="0" b="0"/>
+          <wp:docPr id="1950420584" name="圖片 1"/>
+          <wp:cNvGraphicFramePr>
+            <a:graphicFrameLocks xmlns:a="http://schemas.openxmlformats.org/drawingml/2006/main" noChangeAspect="1"/>
+          </wp:cNvGraphicFramePr>
+          <a:graphic xmlns:a="http://schemas.openxmlformats.org/drawingml/2006/main">
+            <a:graphicData uri="http://schemas.openxmlformats.org/drawingml/2006/picture">
+              <pic:pic xmlns:pic="http://schemas.openxmlformats.org/drawingml/2006/picture">
+                <pic:nvPicPr>
+                  <pic:cNvPr id="1950420584" name=""/>
+                  <pic:cNvPicPr/>
+                </pic:nvPicPr>
+                <pic:blipFill>
+                  <a:blip r:embed="rId1"/>
+                  <a:stretch>
+                    <a:fillRect/>
+                  </a:stretch>
+                </pic:blipFill>
+                <pic:spPr>
+                  <a:xfrm>
+                    <a:off x="0" y="0"/>
+                    <a:ext cx="1803400" cy="563563"/>
+                  </a:xfrm>
+                  <a:prstGeom prst="rect">
+                    <a:avLst/>
+                  </a:prstGeom>
+                </pic:spPr>
+              </pic:pic>
+            </a:graphicData>
+          </a:graphic>
+        </wp:inline>
+      </w:drawing>
     </w:r>
   </w:p>
 </w:hdr>

</xml_diff>